<commit_message>
Add Scrum section with user stories and acceptance criteria
</commit_message>
<xml_diff>
--- a/docs/Sistema de Gestión Hotelera HotelSys RD.docx
+++ b/docs/Sistema de Gestión Hotelera HotelSys RD.docx
@@ -1230,7 +1230,7 @@
       <w:pPr>
         <w:numPr>
           <w:ilvl w:val="0"/>
-          <w:numId w:val="4"/>
+          <w:numId w:val="5"/>
         </w:numPr>
         <w:spacing w:after="0" w:afterAutospacing="0" w:before="240" w:lineRule="auto"/>
         <w:ind w:left="720" w:hanging="360"/>
@@ -1246,7 +1246,7 @@
       <w:pPr>
         <w:numPr>
           <w:ilvl w:val="0"/>
-          <w:numId w:val="4"/>
+          <w:numId w:val="5"/>
         </w:numPr>
         <w:spacing w:after="0" w:afterAutospacing="0" w:before="0" w:beforeAutospacing="0" w:lineRule="auto"/>
         <w:ind w:left="720" w:hanging="360"/>
@@ -1262,7 +1262,7 @@
       <w:pPr>
         <w:numPr>
           <w:ilvl w:val="0"/>
-          <w:numId w:val="4"/>
+          <w:numId w:val="5"/>
         </w:numPr>
         <w:spacing w:after="0" w:afterAutospacing="0" w:before="0" w:beforeAutospacing="0" w:lineRule="auto"/>
         <w:ind w:left="720" w:hanging="360"/>
@@ -1278,7 +1278,7 @@
       <w:pPr>
         <w:numPr>
           <w:ilvl w:val="0"/>
-          <w:numId w:val="4"/>
+          <w:numId w:val="5"/>
         </w:numPr>
         <w:spacing w:after="0" w:afterAutospacing="0" w:before="0" w:beforeAutospacing="0" w:lineRule="auto"/>
         <w:ind w:left="720" w:hanging="360"/>
@@ -1294,7 +1294,7 @@
       <w:pPr>
         <w:numPr>
           <w:ilvl w:val="0"/>
-          <w:numId w:val="4"/>
+          <w:numId w:val="5"/>
         </w:numPr>
         <w:spacing w:after="0" w:afterAutospacing="0" w:before="0" w:beforeAutospacing="0" w:lineRule="auto"/>
         <w:ind w:left="720" w:hanging="360"/>
@@ -1310,7 +1310,7 @@
       <w:pPr>
         <w:numPr>
           <w:ilvl w:val="0"/>
-          <w:numId w:val="4"/>
+          <w:numId w:val="5"/>
         </w:numPr>
         <w:spacing w:after="0" w:afterAutospacing="0" w:before="0" w:beforeAutospacing="0" w:lineRule="auto"/>
         <w:ind w:left="720" w:hanging="360"/>
@@ -1326,7 +1326,7 @@
       <w:pPr>
         <w:numPr>
           <w:ilvl w:val="0"/>
-          <w:numId w:val="4"/>
+          <w:numId w:val="5"/>
         </w:numPr>
         <w:spacing w:after="0" w:afterAutospacing="0" w:before="0" w:beforeAutospacing="0" w:lineRule="auto"/>
         <w:ind w:left="720" w:hanging="360"/>
@@ -1342,7 +1342,7 @@
       <w:pPr>
         <w:numPr>
           <w:ilvl w:val="0"/>
-          <w:numId w:val="4"/>
+          <w:numId w:val="5"/>
         </w:numPr>
         <w:spacing w:after="0" w:afterAutospacing="0" w:before="0" w:beforeAutospacing="0" w:lineRule="auto"/>
         <w:ind w:left="720" w:hanging="360"/>
@@ -1358,7 +1358,7 @@
       <w:pPr>
         <w:numPr>
           <w:ilvl w:val="0"/>
-          <w:numId w:val="4"/>
+          <w:numId w:val="5"/>
         </w:numPr>
         <w:spacing w:after="0" w:afterAutospacing="0" w:before="0" w:beforeAutospacing="0" w:lineRule="auto"/>
         <w:ind w:left="720" w:hanging="360"/>
@@ -1374,7 +1374,7 @@
       <w:pPr>
         <w:numPr>
           <w:ilvl w:val="0"/>
-          <w:numId w:val="4"/>
+          <w:numId w:val="5"/>
         </w:numPr>
         <w:spacing w:after="240" w:before="0" w:beforeAutospacing="0" w:lineRule="auto"/>
         <w:ind w:left="720" w:hanging="360"/>
@@ -2800,6 +2800,984 @@
         <w:rPr>
           <w:rtl w:val="0"/>
         </w:rPr>
+        <w:t xml:space="preserve">Tareas a ejecutar:</w:t>
+      </w:r>
+    </w:p>
+    <w:p>
+      <w:pPr>
+        <w:rPr/>
+      </w:pPr>
+      <w:r>
+        <w:rPr>
+          <w:rtl w:val="0"/>
+        </w:rPr>
+        <w:t xml:space="preserve">levantamiento de requerimientos</w:t>
+      </w:r>
+    </w:p>
+    <w:p>
+      <w:pPr>
+        <w:rPr/>
+      </w:pPr>
+      <w:r>
+        <w:rPr>
+          <w:rtl w:val="0"/>
+        </w:rPr>
+        <w:t xml:space="preserve">definición del alcance del sistema</w:t>
+      </w:r>
+    </w:p>
+    <w:p>
+      <w:pPr>
+        <w:rPr/>
+      </w:pPr>
+      <w:r>
+        <w:rPr>
+          <w:rtl w:val="0"/>
+        </w:rPr>
+        <w:t xml:space="preserve">diseño de base de datos</w:t>
+      </w:r>
+    </w:p>
+    <w:p>
+      <w:pPr>
+        <w:rPr/>
+      </w:pPr>
+      <w:r>
+        <w:rPr>
+          <w:rtl w:val="0"/>
+        </w:rPr>
+        <w:t xml:space="preserve">configuración del proyecto ASP.NET</w:t>
+      </w:r>
+    </w:p>
+    <w:p>
+      <w:pPr>
+        <w:rPr/>
+      </w:pPr>
+      <w:r>
+        <w:rPr>
+          <w:rtl w:val="0"/>
+        </w:rPr>
+        <w:t xml:space="preserve">desarrollo del módulo de habitaciones</w:t>
+      </w:r>
+    </w:p>
+    <w:p>
+      <w:pPr>
+        <w:rPr/>
+      </w:pPr>
+      <w:r>
+        <w:rPr>
+          <w:rtl w:val="0"/>
+        </w:rPr>
+        <w:t xml:space="preserve">desarrollo del módulo de clientes</w:t>
+      </w:r>
+    </w:p>
+    <w:p>
+      <w:pPr>
+        <w:rPr/>
+      </w:pPr>
+      <w:r>
+        <w:rPr>
+          <w:rtl w:val="0"/>
+        </w:rPr>
+        <w:t xml:space="preserve">desarrollo del módulo de reservaciones</w:t>
+      </w:r>
+    </w:p>
+    <w:p>
+      <w:pPr>
+        <w:rPr/>
+      </w:pPr>
+      <w:r>
+        <w:rPr>
+          <w:rtl w:val="0"/>
+        </w:rPr>
+        <w:t xml:space="preserve">pruebas funcionales</w:t>
+      </w:r>
+    </w:p>
+    <w:p>
+      <w:pPr>
+        <w:rPr/>
+      </w:pPr>
+      <w:r>
+        <w:rPr>
+          <w:rtl w:val="0"/>
+        </w:rPr>
+        <w:t xml:space="preserve">automatización básica de pruebas</w:t>
+      </w:r>
+    </w:p>
+    <w:p>
+      <w:pPr>
+        <w:rPr/>
+      </w:pPr>
+      <w:r>
+        <w:rPr>
+          <w:rtl w:val="0"/>
+        </w:rPr>
+        <w:t xml:space="preserve">documentación y video final</w:t>
+      </w:r>
+    </w:p>
+    <w:p>
+      <w:pPr>
+        <w:rPr/>
+      </w:pPr>
+      <w:r>
+        <w:rPr>
+          <w:rtl w:val="0"/>
+        </w:rPr>
+      </w:r>
+    </w:p>
+    <w:p>
+      <w:pPr>
+        <w:rPr/>
+      </w:pPr>
+      <w:r>
+        <w:rPr>
+          <w:rtl w:val="0"/>
+        </w:rPr>
+        <w:t xml:space="preserve">Equipo de trabajo:</w:t>
+        <w:br w:type="textWrapping"/>
+      </w:r>
+    </w:p>
+    <w:p>
+      <w:pPr>
+        <w:spacing w:after="240" w:before="240" w:lineRule="auto"/>
+        <w:rPr/>
+      </w:pPr>
+      <w:r>
+        <w:rPr>
+          <w:b w:val="1"/>
+          <w:bCs w:val="1"/>
+          <w:rtl w:val="0"/>
+        </w:rPr>
+        <w:t xml:space="preserve">Product Owner:</w:t>
+      </w:r>
+      <w:r>
+        <w:rPr>
+          <w:rtl w:val="0"/>
+        </w:rPr>
+        <w:t xml:space="preserve"> Elian Fernández</w:t>
+        <w:br w:type="textWrapping"/>
+        <w:t xml:space="preserve"> Encargado de definir necesidades y alcance del sistema.</w:t>
+      </w:r>
+    </w:p>
+    <w:p>
+      <w:pPr>
+        <w:spacing w:after="240" w:before="240" w:lineRule="auto"/>
+        <w:rPr/>
+      </w:pPr>
+      <w:r>
+        <w:rPr>
+          <w:b w:val="1"/>
+          <w:bCs w:val="1"/>
+          <w:rtl w:val="0"/>
+        </w:rPr>
+        <w:t xml:space="preserve">Scrum Master:</w:t>
+      </w:r>
+      <w:r>
+        <w:rPr>
+          <w:rtl w:val="0"/>
+        </w:rPr>
+        <w:t xml:space="preserve"> Elian Fernández</w:t>
+        <w:br w:type="textWrapping"/>
+        <w:t xml:space="preserve"> Encargado de organizar el trabajo y dar seguimiento al avance.</w:t>
+      </w:r>
+    </w:p>
+    <w:p>
+      <w:pPr>
+        <w:spacing w:after="240" w:before="240" w:lineRule="auto"/>
+        <w:rPr/>
+      </w:pPr>
+      <w:r>
+        <w:rPr>
+          <w:b w:val="1"/>
+          <w:bCs w:val="1"/>
+          <w:rtl w:val="0"/>
+        </w:rPr>
+        <w:t xml:space="preserve">Developer:</w:t>
+      </w:r>
+      <w:r>
+        <w:rPr>
+          <w:rtl w:val="0"/>
+        </w:rPr>
+        <w:t xml:space="preserve"> Elian Fernández</w:t>
+        <w:br w:type="textWrapping"/>
+        <w:t xml:space="preserve"> Encargado del desarrollo técnico del sistema.</w:t>
+      </w:r>
+    </w:p>
+    <w:p>
+      <w:pPr>
+        <w:spacing w:after="240" w:before="240" w:lineRule="auto"/>
+        <w:rPr/>
+      </w:pPr>
+      <w:r>
+        <w:rPr>
+          <w:b w:val="1"/>
+          <w:bCs w:val="1"/>
+          <w:rtl w:val="0"/>
+        </w:rPr>
+        <w:t xml:space="preserve">QA:</w:t>
+      </w:r>
+      <w:r>
+        <w:rPr>
+          <w:rtl w:val="0"/>
+        </w:rPr>
+        <w:t xml:space="preserve"> Elian Fernández</w:t>
+        <w:br w:type="textWrapping"/>
+        <w:t xml:space="preserve"> Encargado de diseñar y ejecutar pruebas funcionales y automatizadas.</w:t>
+      </w:r>
+    </w:p>
+    <w:p>
+      <w:pPr>
+        <w:pStyle w:val="Heading1"/>
+        <w:keepNext w:val="0"/>
+        <w:keepLines w:val="0"/>
+        <w:spacing w:before="480" w:lineRule="auto"/>
+        <w:rPr/>
+      </w:pPr>
+      <w:bookmarkStart w:colFirst="0" w:colLast="0" w:name="_yoecsig2z5g3" w:id="8"/>
+      <w:bookmarkEnd w:id="8"/>
+      <w:r>
+        <w:rPr>
+          <w:b w:val="1"/>
+          <w:bCs w:val="1"/>
+          <w:sz w:val="46"/>
+          <w:szCs w:val="46"/>
+          <w:rtl w:val="0"/>
+        </w:rPr>
+        <w:t xml:space="preserve">Herramientas a utilizar</w:t>
+      </w:r>
+      <w:r>
+        <w:rPr>
+          <w:rtl w:val="0"/>
+        </w:rPr>
+      </w:r>
+    </w:p>
+    <w:p>
+      <w:pPr>
+        <w:numPr>
+          <w:ilvl w:val="0"/>
+          <w:numId w:val="4"/>
+        </w:numPr>
+        <w:spacing w:after="0" w:afterAutospacing="0" w:before="240" w:lineRule="auto"/>
+        <w:ind w:left="720" w:hanging="360"/>
+      </w:pPr>
+      <w:r>
+        <w:rPr>
+          <w:b w:val="1"/>
+          <w:bCs w:val="1"/>
+          <w:rtl w:val="0"/>
+        </w:rPr>
+        <w:t xml:space="preserve">Visual Studio</w:t>
+      </w:r>
+      <w:r>
+        <w:rPr>
+          <w:rtl w:val="0"/>
+        </w:rPr>
+        <w:t xml:space="preserve"> para desarrollo</w:t>
+      </w:r>
+    </w:p>
+    <w:p>
+      <w:pPr>
+        <w:numPr>
+          <w:ilvl w:val="0"/>
+          <w:numId w:val="4"/>
+        </w:numPr>
+        <w:spacing w:after="0" w:afterAutospacing="0" w:before="0" w:beforeAutospacing="0" w:lineRule="auto"/>
+        <w:ind w:left="720" w:hanging="360"/>
+      </w:pPr>
+      <w:r>
+        <w:rPr>
+          <w:b w:val="1"/>
+          <w:bCs w:val="1"/>
+          <w:rtl w:val="0"/>
+        </w:rPr>
+        <w:t xml:space="preserve">ASP.NET Core MVC</w:t>
+      </w:r>
+      <w:r>
+        <w:rPr>
+          <w:rtl w:val="0"/>
+        </w:rPr>
+        <w:t xml:space="preserve"> como framework</w:t>
+      </w:r>
+    </w:p>
+    <w:p>
+      <w:pPr>
+        <w:numPr>
+          <w:ilvl w:val="0"/>
+          <w:numId w:val="4"/>
+        </w:numPr>
+        <w:spacing w:after="0" w:afterAutospacing="0" w:before="0" w:beforeAutospacing="0" w:lineRule="auto"/>
+        <w:ind w:left="720" w:hanging="360"/>
+      </w:pPr>
+      <w:r>
+        <w:rPr>
+          <w:b w:val="1"/>
+          <w:bCs w:val="1"/>
+          <w:rtl w:val="0"/>
+        </w:rPr>
+        <w:t xml:space="preserve">SQL Server / LocalDB</w:t>
+      </w:r>
+      <w:r>
+        <w:rPr>
+          <w:rtl w:val="0"/>
+        </w:rPr>
+        <w:t xml:space="preserve"> para base de datos</w:t>
+      </w:r>
+    </w:p>
+    <w:p>
+      <w:pPr>
+        <w:numPr>
+          <w:ilvl w:val="0"/>
+          <w:numId w:val="4"/>
+        </w:numPr>
+        <w:spacing w:after="0" w:afterAutospacing="0" w:before="0" w:beforeAutospacing="0" w:lineRule="auto"/>
+        <w:ind w:left="720" w:hanging="360"/>
+      </w:pPr>
+      <w:r>
+        <w:rPr>
+          <w:b w:val="1"/>
+          <w:bCs w:val="1"/>
+          <w:rtl w:val="0"/>
+        </w:rPr>
+        <w:t xml:space="preserve">Entity Framework Core</w:t>
+      </w:r>
+      <w:r>
+        <w:rPr>
+          <w:rtl w:val="0"/>
+        </w:rPr>
+        <w:t xml:space="preserve"> para acceso a datos</w:t>
+      </w:r>
+    </w:p>
+    <w:p>
+      <w:pPr>
+        <w:numPr>
+          <w:ilvl w:val="0"/>
+          <w:numId w:val="4"/>
+        </w:numPr>
+        <w:spacing w:after="0" w:afterAutospacing="0" w:before="0" w:beforeAutospacing="0" w:lineRule="auto"/>
+        <w:ind w:left="720" w:hanging="360"/>
+      </w:pPr>
+      <w:r>
+        <w:rPr>
+          <w:b w:val="1"/>
+          <w:bCs w:val="1"/>
+          <w:rtl w:val="0"/>
+        </w:rPr>
+        <w:t xml:space="preserve">Git y GitHub</w:t>
+      </w:r>
+      <w:r>
+        <w:rPr>
+          <w:rtl w:val="0"/>
+        </w:rPr>
+        <w:t xml:space="preserve"> para control de versiones</w:t>
+      </w:r>
+    </w:p>
+    <w:p>
+      <w:pPr>
+        <w:numPr>
+          <w:ilvl w:val="0"/>
+          <w:numId w:val="4"/>
+        </w:numPr>
+        <w:spacing w:after="0" w:afterAutospacing="0" w:before="0" w:beforeAutospacing="0" w:lineRule="auto"/>
+        <w:ind w:left="720" w:hanging="360"/>
+      </w:pPr>
+      <w:r>
+        <w:rPr>
+          <w:b w:val="1"/>
+          <w:bCs w:val="1"/>
+          <w:rtl w:val="0"/>
+        </w:rPr>
+        <w:t xml:space="preserve">GitHub Desktop</w:t>
+      </w:r>
+      <w:r>
+        <w:rPr>
+          <w:rtl w:val="0"/>
+        </w:rPr>
+        <w:t xml:space="preserve"> para manejo de ramas y commits</w:t>
+      </w:r>
+    </w:p>
+    <w:p>
+      <w:pPr>
+        <w:numPr>
+          <w:ilvl w:val="0"/>
+          <w:numId w:val="4"/>
+        </w:numPr>
+        <w:spacing w:after="0" w:afterAutospacing="0" w:before="0" w:beforeAutospacing="0" w:lineRule="auto"/>
+        <w:ind w:left="720" w:hanging="360"/>
+      </w:pPr>
+      <w:r>
+        <w:rPr>
+          <w:b w:val="1"/>
+          <w:bCs w:val="1"/>
+          <w:rtl w:val="0"/>
+        </w:rPr>
+        <w:t xml:space="preserve">Jira</w:t>
+      </w:r>
+      <w:r>
+        <w:rPr>
+          <w:rtl w:val="0"/>
+        </w:rPr>
+        <w:t xml:space="preserve"> para gestión ágil del proyecto</w:t>
+      </w:r>
+    </w:p>
+    <w:p>
+      <w:pPr>
+        <w:numPr>
+          <w:ilvl w:val="0"/>
+          <w:numId w:val="4"/>
+        </w:numPr>
+        <w:spacing w:after="240" w:before="0" w:beforeAutospacing="0" w:lineRule="auto"/>
+        <w:ind w:left="720" w:hanging="360"/>
+      </w:pPr>
+      <w:r>
+        <w:rPr>
+          <w:b w:val="1"/>
+          <w:bCs w:val="1"/>
+          <w:rtl w:val="0"/>
+        </w:rPr>
+        <w:t xml:space="preserve">Selenium WebDriver con C#</w:t>
+      </w:r>
+      <w:r>
+        <w:rPr>
+          <w:rtl w:val="0"/>
+        </w:rPr>
+        <w:t xml:space="preserve"> para automatización de pruebas</w:t>
+      </w:r>
+    </w:p>
+    <w:p>
+      <w:pPr>
+        <w:rPr/>
+      </w:pPr>
+      <w:r>
+        <w:rPr>
+          <w:rtl w:val="0"/>
+        </w:rPr>
+        <w:t xml:space="preserve">Ceremonias Scrum:</w:t>
+      </w:r>
+    </w:p>
+    <w:tbl>
+      <w:tblPr>
+        <w:tblStyle w:val="Table2"/>
+        <w:tblW w:w="9025.511811023624" w:type="dxa"/>
+        <w:jc w:val="left"/>
+        <w:tblBorders>
+          <w:top w:color="000000" w:space="0" w:sz="0" w:val="nil"/>
+          <w:left w:color="000000" w:space="0" w:sz="0" w:val="nil"/>
+          <w:bottom w:color="000000" w:space="0" w:sz="0" w:val="nil"/>
+          <w:right w:color="000000" w:space="0" w:sz="0" w:val="nil"/>
+          <w:insideH w:color="000000" w:space="0" w:sz="0" w:val="nil"/>
+          <w:insideV w:color="000000" w:space="0" w:sz="0" w:val="nil"/>
+        </w:tblBorders>
+        <w:tblLayout w:type="fixed"/>
+        <w:tblLook w:val="0600"/>
+      </w:tblPr>
+      <w:tblGrid>
+        <w:gridCol w:w="2106.432581094827"/>
+        <w:gridCol w:w="2595.8542741965866"/>
+        <w:gridCol w:w="4323.224955732208"/>
+        <w:tblGridChange w:id="0">
+          <w:tblGrid>
+            <w:gridCol w:w="2106.432581094827"/>
+            <w:gridCol w:w="2595.8542741965866"/>
+            <w:gridCol w:w="4323.224955732208"/>
+          </w:tblGrid>
+        </w:tblGridChange>
+      </w:tblGrid>
+      <w:tr>
+        <w:trPr>
+          <w:cantSplit w:val="0"/>
+          <w:trHeight w:val="500" w:hRule="atLeast"/>
+          <w:tblHeader w:val="0"/>
+        </w:trPr>
+        <w:tc>
+          <w:tcPr>
+            <w:tcBorders>
+              <w:top w:color="000000" w:space="0" w:sz="8" w:val="single"/>
+              <w:left w:color="000000" w:space="0" w:sz="8" w:val="single"/>
+              <w:bottom w:color="000000" w:space="0" w:sz="8" w:val="single"/>
+              <w:right w:color="000000" w:space="0" w:sz="8" w:val="single"/>
+            </w:tcBorders>
+            <w:tcMar>
+              <w:top w:w="100.0" w:type="dxa"/>
+              <w:left w:w="100.0" w:type="dxa"/>
+              <w:bottom w:w="100.0" w:type="dxa"/>
+              <w:right w:w="100.0" w:type="dxa"/>
+            </w:tcMar>
+            <w:vAlign w:val="top"/>
+          </w:tcPr>
+          <w:p>
+            <w:pPr>
+              <w:jc w:val="center"/>
+              <w:rPr/>
+            </w:pPr>
+            <w:r>
+              <w:rPr>
+                <w:b w:val="1"/>
+                <w:bCs w:val="1"/>
+                <w:rtl w:val="0"/>
+              </w:rPr>
+              <w:t xml:space="preserve">Ceremonia</w:t>
+            </w:r>
+            <w:r>
+              <w:rPr>
+                <w:rtl w:val="0"/>
+              </w:rPr>
+            </w:r>
+          </w:p>
+        </w:tc>
+        <w:tc>
+          <w:tcPr>
+            <w:tcBorders>
+              <w:top w:color="000000" w:space="0" w:sz="8" w:val="single"/>
+              <w:left w:color="000000" w:space="0" w:sz="8" w:val="single"/>
+              <w:bottom w:color="000000" w:space="0" w:sz="8" w:val="single"/>
+              <w:right w:color="000000" w:space="0" w:sz="8" w:val="single"/>
+            </w:tcBorders>
+            <w:tcMar>
+              <w:top w:w="100.0" w:type="dxa"/>
+              <w:left w:w="100.0" w:type="dxa"/>
+              <w:bottom w:w="100.0" w:type="dxa"/>
+              <w:right w:w="100.0" w:type="dxa"/>
+            </w:tcMar>
+            <w:vAlign w:val="top"/>
+          </w:tcPr>
+          <w:p>
+            <w:pPr>
+              <w:jc w:val="center"/>
+              <w:rPr/>
+            </w:pPr>
+            <w:r>
+              <w:rPr>
+                <w:b w:val="1"/>
+                <w:bCs w:val="1"/>
+                <w:rtl w:val="0"/>
+              </w:rPr>
+              <w:t xml:space="preserve">Fecha</w:t>
+            </w:r>
+            <w:r>
+              <w:rPr>
+                <w:rtl w:val="0"/>
+              </w:rPr>
+            </w:r>
+          </w:p>
+        </w:tc>
+        <w:tc>
+          <w:tcPr>
+            <w:tcBorders>
+              <w:top w:color="000000" w:space="0" w:sz="8" w:val="single"/>
+              <w:left w:color="000000" w:space="0" w:sz="8" w:val="single"/>
+              <w:bottom w:color="000000" w:space="0" w:sz="8" w:val="single"/>
+              <w:right w:color="000000" w:space="0" w:sz="8" w:val="single"/>
+            </w:tcBorders>
+            <w:tcMar>
+              <w:top w:w="100.0" w:type="dxa"/>
+              <w:left w:w="100.0" w:type="dxa"/>
+              <w:bottom w:w="100.0" w:type="dxa"/>
+              <w:right w:w="100.0" w:type="dxa"/>
+            </w:tcMar>
+            <w:vAlign w:val="top"/>
+          </w:tcPr>
+          <w:p>
+            <w:pPr>
+              <w:jc w:val="center"/>
+              <w:rPr/>
+            </w:pPr>
+            <w:r>
+              <w:rPr>
+                <w:b w:val="1"/>
+                <w:bCs w:val="1"/>
+                <w:rtl w:val="0"/>
+              </w:rPr>
+              <w:t xml:space="preserve">Objetivo</w:t>
+            </w:r>
+            <w:r>
+              <w:rPr>
+                <w:rtl w:val="0"/>
+              </w:rPr>
+            </w:r>
+          </w:p>
+        </w:tc>
+      </w:tr>
+      <w:tr>
+        <w:trPr>
+          <w:cantSplit w:val="0"/>
+          <w:trHeight w:val="500" w:hRule="atLeast"/>
+          <w:tblHeader w:val="0"/>
+        </w:trPr>
+        <w:tc>
+          <w:tcPr>
+            <w:tcBorders>
+              <w:top w:color="000000" w:space="0" w:sz="8" w:val="single"/>
+              <w:left w:color="000000" w:space="0" w:sz="8" w:val="single"/>
+              <w:bottom w:color="000000" w:space="0" w:sz="8" w:val="single"/>
+              <w:right w:color="000000" w:space="0" w:sz="8" w:val="single"/>
+            </w:tcBorders>
+            <w:tcMar>
+              <w:top w:w="100.0" w:type="dxa"/>
+              <w:left w:w="100.0" w:type="dxa"/>
+              <w:bottom w:w="100.0" w:type="dxa"/>
+              <w:right w:w="100.0" w:type="dxa"/>
+            </w:tcMar>
+            <w:vAlign w:val="top"/>
+          </w:tcPr>
+          <w:p>
+            <w:pPr>
+              <w:rPr/>
+            </w:pPr>
+            <w:r>
+              <w:rPr>
+                <w:rtl w:val="0"/>
+              </w:rPr>
+              <w:t xml:space="preserve">Sprint Planning</w:t>
+            </w:r>
+          </w:p>
+        </w:tc>
+        <w:tc>
+          <w:tcPr>
+            <w:tcBorders>
+              <w:top w:color="000000" w:space="0" w:sz="8" w:val="single"/>
+              <w:left w:color="000000" w:space="0" w:sz="8" w:val="single"/>
+              <w:bottom w:color="000000" w:space="0" w:sz="8" w:val="single"/>
+              <w:right w:color="000000" w:space="0" w:sz="8" w:val="single"/>
+            </w:tcBorders>
+            <w:tcMar>
+              <w:top w:w="100.0" w:type="dxa"/>
+              <w:left w:w="100.0" w:type="dxa"/>
+              <w:bottom w:w="100.0" w:type="dxa"/>
+              <w:right w:w="100.0" w:type="dxa"/>
+            </w:tcMar>
+            <w:vAlign w:val="top"/>
+          </w:tcPr>
+          <w:p>
+            <w:pPr>
+              <w:rPr/>
+            </w:pPr>
+            <w:r>
+              <w:rPr>
+                <w:rtl w:val="0"/>
+              </w:rPr>
+              <w:t xml:space="preserve">09/04/2026</w:t>
+            </w:r>
+          </w:p>
+        </w:tc>
+        <w:tc>
+          <w:tcPr>
+            <w:tcBorders>
+              <w:top w:color="000000" w:space="0" w:sz="8" w:val="single"/>
+              <w:left w:color="000000" w:space="0" w:sz="8" w:val="single"/>
+              <w:bottom w:color="000000" w:space="0" w:sz="8" w:val="single"/>
+              <w:right w:color="000000" w:space="0" w:sz="8" w:val="single"/>
+            </w:tcBorders>
+            <w:tcMar>
+              <w:top w:w="100.0" w:type="dxa"/>
+              <w:left w:w="100.0" w:type="dxa"/>
+              <w:bottom w:w="100.0" w:type="dxa"/>
+              <w:right w:w="100.0" w:type="dxa"/>
+            </w:tcMar>
+            <w:vAlign w:val="top"/>
+          </w:tcPr>
+          <w:p>
+            <w:pPr>
+              <w:rPr/>
+            </w:pPr>
+            <w:r>
+              <w:rPr>
+                <w:rtl w:val="0"/>
+              </w:rPr>
+              <w:t xml:space="preserve">Definir alcance, tareas y tecnologías</w:t>
+            </w:r>
+          </w:p>
+        </w:tc>
+      </w:tr>
+      <w:tr>
+        <w:trPr>
+          <w:cantSplit w:val="0"/>
+          <w:trHeight w:val="785" w:hRule="atLeast"/>
+          <w:tblHeader w:val="0"/>
+        </w:trPr>
+        <w:tc>
+          <w:tcPr>
+            <w:tcBorders>
+              <w:top w:color="000000" w:space="0" w:sz="8" w:val="single"/>
+              <w:left w:color="000000" w:space="0" w:sz="8" w:val="single"/>
+              <w:bottom w:color="000000" w:space="0" w:sz="8" w:val="single"/>
+              <w:right w:color="000000" w:space="0" w:sz="8" w:val="single"/>
+            </w:tcBorders>
+            <w:tcMar>
+              <w:top w:w="100.0" w:type="dxa"/>
+              <w:left w:w="100.0" w:type="dxa"/>
+              <w:bottom w:w="100.0" w:type="dxa"/>
+              <w:right w:w="100.0" w:type="dxa"/>
+            </w:tcMar>
+            <w:vAlign w:val="top"/>
+          </w:tcPr>
+          <w:p>
+            <w:pPr>
+              <w:rPr/>
+            </w:pPr>
+            <w:r>
+              <w:rPr>
+                <w:rtl w:val="0"/>
+              </w:rPr>
+              <w:t xml:space="preserve">Daily Stand-up</w:t>
+            </w:r>
+          </w:p>
+        </w:tc>
+        <w:tc>
+          <w:tcPr>
+            <w:tcBorders>
+              <w:top w:color="000000" w:space="0" w:sz="8" w:val="single"/>
+              <w:left w:color="000000" w:space="0" w:sz="8" w:val="single"/>
+              <w:bottom w:color="000000" w:space="0" w:sz="8" w:val="single"/>
+              <w:right w:color="000000" w:space="0" w:sz="8" w:val="single"/>
+            </w:tcBorders>
+            <w:tcMar>
+              <w:top w:w="100.0" w:type="dxa"/>
+              <w:left w:w="100.0" w:type="dxa"/>
+              <w:bottom w:w="100.0" w:type="dxa"/>
+              <w:right w:w="100.0" w:type="dxa"/>
+            </w:tcMar>
+            <w:vAlign w:val="top"/>
+          </w:tcPr>
+          <w:p>
+            <w:pPr>
+              <w:rPr/>
+            </w:pPr>
+            <w:r>
+              <w:rPr>
+                <w:rtl w:val="0"/>
+              </w:rPr>
+              <w:t xml:space="preserve">10/04/2026 al 16/04/2026</w:t>
+            </w:r>
+          </w:p>
+        </w:tc>
+        <w:tc>
+          <w:tcPr>
+            <w:tcBorders>
+              <w:top w:color="000000" w:space="0" w:sz="8" w:val="single"/>
+              <w:left w:color="000000" w:space="0" w:sz="8" w:val="single"/>
+              <w:bottom w:color="000000" w:space="0" w:sz="8" w:val="single"/>
+              <w:right w:color="000000" w:space="0" w:sz="8" w:val="single"/>
+            </w:tcBorders>
+            <w:tcMar>
+              <w:top w:w="100.0" w:type="dxa"/>
+              <w:left w:w="100.0" w:type="dxa"/>
+              <w:bottom w:w="100.0" w:type="dxa"/>
+              <w:right w:w="100.0" w:type="dxa"/>
+            </w:tcMar>
+            <w:vAlign w:val="top"/>
+          </w:tcPr>
+          <w:p>
+            <w:pPr>
+              <w:rPr/>
+            </w:pPr>
+            <w:r>
+              <w:rPr>
+                <w:rtl w:val="0"/>
+              </w:rPr>
+              <w:t xml:space="preserve">Revisar avances, bloqueos y próximos pasos</w:t>
+            </w:r>
+          </w:p>
+        </w:tc>
+      </w:tr>
+      <w:tr>
+        <w:trPr>
+          <w:cantSplit w:val="0"/>
+          <w:trHeight w:val="500" w:hRule="atLeast"/>
+          <w:tblHeader w:val="0"/>
+        </w:trPr>
+        <w:tc>
+          <w:tcPr>
+            <w:tcBorders>
+              <w:top w:color="000000" w:space="0" w:sz="8" w:val="single"/>
+              <w:left w:color="000000" w:space="0" w:sz="8" w:val="single"/>
+              <w:bottom w:color="000000" w:space="0" w:sz="8" w:val="single"/>
+              <w:right w:color="000000" w:space="0" w:sz="8" w:val="single"/>
+            </w:tcBorders>
+            <w:tcMar>
+              <w:top w:w="100.0" w:type="dxa"/>
+              <w:left w:w="100.0" w:type="dxa"/>
+              <w:bottom w:w="100.0" w:type="dxa"/>
+              <w:right w:w="100.0" w:type="dxa"/>
+            </w:tcMar>
+            <w:vAlign w:val="top"/>
+          </w:tcPr>
+          <w:p>
+            <w:pPr>
+              <w:rPr/>
+            </w:pPr>
+            <w:r>
+              <w:rPr>
+                <w:rtl w:val="0"/>
+              </w:rPr>
+              <w:t xml:space="preserve">Sprint Review</w:t>
+            </w:r>
+          </w:p>
+        </w:tc>
+        <w:tc>
+          <w:tcPr>
+            <w:tcBorders>
+              <w:top w:color="000000" w:space="0" w:sz="8" w:val="single"/>
+              <w:left w:color="000000" w:space="0" w:sz="8" w:val="single"/>
+              <w:bottom w:color="000000" w:space="0" w:sz="8" w:val="single"/>
+              <w:right w:color="000000" w:space="0" w:sz="8" w:val="single"/>
+            </w:tcBorders>
+            <w:tcMar>
+              <w:top w:w="100.0" w:type="dxa"/>
+              <w:left w:w="100.0" w:type="dxa"/>
+              <w:bottom w:w="100.0" w:type="dxa"/>
+              <w:right w:w="100.0" w:type="dxa"/>
+            </w:tcMar>
+            <w:vAlign w:val="top"/>
+          </w:tcPr>
+          <w:p>
+            <w:pPr>
+              <w:rPr/>
+            </w:pPr>
+            <w:r>
+              <w:rPr>
+                <w:rtl w:val="0"/>
+              </w:rPr>
+              <w:t xml:space="preserve">16/04/2026</w:t>
+            </w:r>
+          </w:p>
+        </w:tc>
+        <w:tc>
+          <w:tcPr>
+            <w:tcBorders>
+              <w:top w:color="000000" w:space="0" w:sz="8" w:val="single"/>
+              <w:left w:color="000000" w:space="0" w:sz="8" w:val="single"/>
+              <w:bottom w:color="000000" w:space="0" w:sz="8" w:val="single"/>
+              <w:right w:color="000000" w:space="0" w:sz="8" w:val="single"/>
+            </w:tcBorders>
+            <w:tcMar>
+              <w:top w:w="100.0" w:type="dxa"/>
+              <w:left w:w="100.0" w:type="dxa"/>
+              <w:bottom w:w="100.0" w:type="dxa"/>
+              <w:right w:w="100.0" w:type="dxa"/>
+            </w:tcMar>
+            <w:vAlign w:val="top"/>
+          </w:tcPr>
+          <w:p>
+            <w:pPr>
+              <w:rPr/>
+            </w:pPr>
+            <w:r>
+              <w:rPr>
+                <w:rtl w:val="0"/>
+              </w:rPr>
+              <w:t xml:space="preserve">Mostrar el incremento funcional del sistema</w:t>
+            </w:r>
+          </w:p>
+        </w:tc>
+      </w:tr>
+      <w:tr>
+        <w:trPr>
+          <w:cantSplit w:val="0"/>
+          <w:trHeight w:val="785" w:hRule="atLeast"/>
+          <w:tblHeader w:val="0"/>
+        </w:trPr>
+        <w:tc>
+          <w:tcPr>
+            <w:tcBorders>
+              <w:top w:color="000000" w:space="0" w:sz="8" w:val="single"/>
+              <w:left w:color="000000" w:space="0" w:sz="8" w:val="single"/>
+              <w:bottom w:color="000000" w:space="0" w:sz="8" w:val="single"/>
+              <w:right w:color="000000" w:space="0" w:sz="8" w:val="single"/>
+            </w:tcBorders>
+            <w:tcMar>
+              <w:top w:w="100.0" w:type="dxa"/>
+              <w:left w:w="100.0" w:type="dxa"/>
+              <w:bottom w:w="100.0" w:type="dxa"/>
+              <w:right w:w="100.0" w:type="dxa"/>
+            </w:tcMar>
+            <w:vAlign w:val="top"/>
+          </w:tcPr>
+          <w:p>
+            <w:pPr>
+              <w:rPr/>
+            </w:pPr>
+            <w:r>
+              <w:rPr>
+                <w:rtl w:val="0"/>
+              </w:rPr>
+              <w:t xml:space="preserve">Sprint Retrospective</w:t>
+            </w:r>
+          </w:p>
+        </w:tc>
+        <w:tc>
+          <w:tcPr>
+            <w:tcBorders>
+              <w:top w:color="000000" w:space="0" w:sz="8" w:val="single"/>
+              <w:left w:color="000000" w:space="0" w:sz="8" w:val="single"/>
+              <w:bottom w:color="000000" w:space="0" w:sz="8" w:val="single"/>
+              <w:right w:color="000000" w:space="0" w:sz="8" w:val="single"/>
+            </w:tcBorders>
+            <w:tcMar>
+              <w:top w:w="100.0" w:type="dxa"/>
+              <w:left w:w="100.0" w:type="dxa"/>
+              <w:bottom w:w="100.0" w:type="dxa"/>
+              <w:right w:w="100.0" w:type="dxa"/>
+            </w:tcMar>
+            <w:vAlign w:val="top"/>
+          </w:tcPr>
+          <w:p>
+            <w:pPr>
+              <w:rPr/>
+            </w:pPr>
+            <w:r>
+              <w:rPr>
+                <w:rtl w:val="0"/>
+              </w:rPr>
+              <w:t xml:space="preserve">16/04/2026</w:t>
+            </w:r>
+          </w:p>
+        </w:tc>
+        <w:tc>
+          <w:tcPr>
+            <w:tcBorders>
+              <w:top w:color="000000" w:space="0" w:sz="8" w:val="single"/>
+              <w:left w:color="000000" w:space="0" w:sz="8" w:val="single"/>
+              <w:bottom w:color="000000" w:space="0" w:sz="8" w:val="single"/>
+              <w:right w:color="000000" w:space="0" w:sz="8" w:val="single"/>
+            </w:tcBorders>
+            <w:tcMar>
+              <w:top w:w="100.0" w:type="dxa"/>
+              <w:left w:w="100.0" w:type="dxa"/>
+              <w:bottom w:w="100.0" w:type="dxa"/>
+              <w:right w:w="100.0" w:type="dxa"/>
+            </w:tcMar>
+            <w:vAlign w:val="top"/>
+          </w:tcPr>
+          <w:p>
+            <w:pPr>
+              <w:rPr/>
+            </w:pPr>
+            <w:r>
+              <w:rPr>
+                <w:rtl w:val="0"/>
+              </w:rPr>
+              <w:t xml:space="preserve">Evaluar qué salió bien y qué puede mejorar</w:t>
+            </w:r>
+          </w:p>
+        </w:tc>
+      </w:tr>
+    </w:tbl>
+    <w:p>
+      <w:pPr>
+        <w:rPr/>
+      </w:pPr>
+      <w:r>
+        <w:rPr>
+          <w:rtl w:val="0"/>
+        </w:rPr>
+      </w:r>
+    </w:p>
+    <w:p>
+      <w:pPr>
+        <w:rPr/>
+      </w:pPr>
+      <w:r>
+        <w:rPr>
+          <w:rtl w:val="0"/>
+        </w:rPr>
       </w:r>
     </w:p>
     <w:sectPr>
@@ -3146,6 +4124,116 @@
   <w:abstractNum w:abstractNumId="4">
     <w:lvl w:ilvl="0">
       <w:start w:val="1"/>
+      <w:numFmt w:val="bullet"/>
+      <w:lvlText w:val="●"/>
+      <w:lvlJc w:val="left"/>
+      <w:pPr>
+        <w:ind w:left="720" w:hanging="360"/>
+      </w:pPr>
+      <w:rPr>
+        <w:u w:val="none"/>
+      </w:rPr>
+    </w:lvl>
+    <w:lvl w:ilvl="1">
+      <w:start w:val="1"/>
+      <w:numFmt w:val="bullet"/>
+      <w:lvlText w:val="○"/>
+      <w:lvlJc w:val="left"/>
+      <w:pPr>
+        <w:ind w:left="1440" w:hanging="360"/>
+      </w:pPr>
+      <w:rPr>
+        <w:u w:val="none"/>
+      </w:rPr>
+    </w:lvl>
+    <w:lvl w:ilvl="2">
+      <w:start w:val="1"/>
+      <w:numFmt w:val="bullet"/>
+      <w:lvlText w:val="■"/>
+      <w:lvlJc w:val="left"/>
+      <w:pPr>
+        <w:ind w:left="2160" w:hanging="360"/>
+      </w:pPr>
+      <w:rPr>
+        <w:u w:val="none"/>
+      </w:rPr>
+    </w:lvl>
+    <w:lvl w:ilvl="3">
+      <w:start w:val="1"/>
+      <w:numFmt w:val="bullet"/>
+      <w:lvlText w:val="●"/>
+      <w:lvlJc w:val="left"/>
+      <w:pPr>
+        <w:ind w:left="2880" w:hanging="360"/>
+      </w:pPr>
+      <w:rPr>
+        <w:u w:val="none"/>
+      </w:rPr>
+    </w:lvl>
+    <w:lvl w:ilvl="4">
+      <w:start w:val="1"/>
+      <w:numFmt w:val="bullet"/>
+      <w:lvlText w:val="○"/>
+      <w:lvlJc w:val="left"/>
+      <w:pPr>
+        <w:ind w:left="3600" w:hanging="360"/>
+      </w:pPr>
+      <w:rPr>
+        <w:u w:val="none"/>
+      </w:rPr>
+    </w:lvl>
+    <w:lvl w:ilvl="5">
+      <w:start w:val="1"/>
+      <w:numFmt w:val="bullet"/>
+      <w:lvlText w:val="■"/>
+      <w:lvlJc w:val="left"/>
+      <w:pPr>
+        <w:ind w:left="4320" w:hanging="360"/>
+      </w:pPr>
+      <w:rPr>
+        <w:u w:val="none"/>
+      </w:rPr>
+    </w:lvl>
+    <w:lvl w:ilvl="6">
+      <w:start w:val="1"/>
+      <w:numFmt w:val="bullet"/>
+      <w:lvlText w:val="●"/>
+      <w:lvlJc w:val="left"/>
+      <w:pPr>
+        <w:ind w:left="5040" w:hanging="360"/>
+      </w:pPr>
+      <w:rPr>
+        <w:u w:val="none"/>
+      </w:rPr>
+    </w:lvl>
+    <w:lvl w:ilvl="7">
+      <w:start w:val="1"/>
+      <w:numFmt w:val="bullet"/>
+      <w:lvlText w:val="○"/>
+      <w:lvlJc w:val="left"/>
+      <w:pPr>
+        <w:ind w:left="5760" w:hanging="360"/>
+      </w:pPr>
+      <w:rPr>
+        <w:u w:val="none"/>
+      </w:rPr>
+    </w:lvl>
+    <w:lvl w:ilvl="8">
+      <w:start w:val="1"/>
+      <w:numFmt w:val="bullet"/>
+      <w:lvlText w:val="■"/>
+      <w:lvlJc w:val="left"/>
+      <w:pPr>
+        <w:ind w:left="6480" w:hanging="360"/>
+      </w:pPr>
+      <w:rPr>
+        <w:u w:val="none"/>
+      </w:rPr>
+    </w:lvl>
+  </w:abstractNum>
+  <w:abstractNum w:abstractNumId="5">
+    <w:lvl w:ilvl="0">
+      <w:start w:val="1"/>
       <w:numFmt w:val="decimal"/>
       <w:lvlText w:val="%1."/>
       <w:lvlJc w:val="left"/>
@@ -3264,6 +4352,9 @@
   </w:num>
   <w:num w:numId="4">
     <w:abstractNumId w:val="4"/>
+  </w:num>
+  <w:num w:numId="5">
+    <w:abstractNumId w:val="5"/>
   </w:num>
 </w:numbering>
 </file>
@@ -3434,6 +4525,14 @@
     </w:rPr>
   </w:style>
   <w:style w:type="table" w:styleId="Table1">
+    <w:basedOn w:val="TableNormal"/>
+    <w:tblPr>
+      <w:tblStyleRowBandSize w:val="1"/>
+      <w:tblStyleColBandSize w:val="1"/>
+      <w:tblCellMar/>
+    </w:tblPr>
+  </w:style>
+  <w:style w:type="table" w:styleId="Table2">
     <w:basedOn w:val="TableNormal"/>
     <w:tblPr>
       <w:tblStyleRowBandSize w:val="1"/>

</xml_diff>

<commit_message>
Add project test plan section and initial test cases
</commit_message>
<xml_diff>
--- a/docs/Sistema de Gestión Hotelera HotelSys RD.docx
+++ b/docs/Sistema de Gestión Hotelera HotelSys RD.docx
@@ -2952,7 +2952,7 @@
         <w:rPr>
           <w:rtl w:val="0"/>
         </w:rPr>
-        <w:t xml:space="preserve"> Elian Fernández</w:t>
+        <w:t xml:space="preserve"> Raymel Guerrero</w:t>
         <w:br w:type="textWrapping"/>
         <w:t xml:space="preserve"> Encargado de definir necesidades y alcance del sistema.</w:t>
       </w:r>
@@ -2974,7 +2974,7 @@
         <w:rPr>
           <w:rtl w:val="0"/>
         </w:rPr>
-        <w:t xml:space="preserve"> Elian Fernández</w:t>
+        <w:t xml:space="preserve"> Raymel Guerrero</w:t>
         <w:br w:type="textWrapping"/>
         <w:t xml:space="preserve"> Encargado de organizar el trabajo y dar seguimiento al avance.</w:t>
       </w:r>
@@ -2996,7 +2996,7 @@
         <w:rPr>
           <w:rtl w:val="0"/>
         </w:rPr>
-        <w:t xml:space="preserve"> Elian Fernández</w:t>
+        <w:t xml:space="preserve"> Raymel Guerrero</w:t>
         <w:br w:type="textWrapping"/>
         <w:t xml:space="preserve"> Encargado del desarrollo técnico del sistema.</w:t>
       </w:r>
@@ -3018,7 +3018,7 @@
         <w:rPr>
           <w:rtl w:val="0"/>
         </w:rPr>
-        <w:t xml:space="preserve"> Elian Fernández</w:t>
+        <w:t xml:space="preserve"> Raymel Guerrero</w:t>
         <w:br w:type="textWrapping"/>
         <w:t xml:space="preserve"> Encargado de diseñar y ejecutar pruebas funcionales y automatizadas.</w:t>
       </w:r>
@@ -3760,6 +3760,3829 @@
         </w:tc>
       </w:tr>
     </w:tbl>
+    <w:p>
+      <w:pPr>
+        <w:rPr/>
+      </w:pPr>
+      <w:r>
+        <w:rPr>
+          <w:rtl w:val="0"/>
+        </w:rPr>
+      </w:r>
+    </w:p>
+    <w:p>
+      <w:pPr>
+        <w:rPr/>
+      </w:pPr>
+      <w:r>
+        <w:rPr>
+          <w:rtl w:val="0"/>
+        </w:rPr>
+        <w:t xml:space="preserve">Plan de pruebas: </w:t>
+      </w:r>
+    </w:p>
+    <w:p>
+      <w:pPr>
+        <w:rPr/>
+      </w:pPr>
+      <w:r>
+        <w:rPr>
+          <w:rtl w:val="0"/>
+        </w:rPr>
+      </w:r>
+    </w:p>
+    <w:p>
+      <w:pPr>
+        <w:pStyle w:val="Heading2"/>
+        <w:keepNext w:val="0"/>
+        <w:keepLines w:val="0"/>
+        <w:spacing w:after="80" w:lineRule="auto"/>
+        <w:rPr>
+          <w:b w:val="1"/>
+          <w:bCs w:val="1"/>
+          <w:sz w:val="34"/>
+          <w:szCs w:val="34"/>
+        </w:rPr>
+      </w:pPr>
+      <w:bookmarkStart w:colFirst="0" w:colLast="0" w:name="_c0enot27uyuo" w:id="9"/>
+      <w:bookmarkEnd w:id="9"/>
+      <w:r>
+        <w:rPr>
+          <w:b w:val="1"/>
+          <w:bCs w:val="1"/>
+          <w:sz w:val="34"/>
+          <w:szCs w:val="34"/>
+          <w:rtl w:val="0"/>
+        </w:rPr>
+        <w:t xml:space="preserve">4.1 Lista de requerimientos funcionales y no funcionales</w:t>
+      </w:r>
+    </w:p>
+    <w:p>
+      <w:pPr>
+        <w:rPr/>
+      </w:pPr>
+      <w:r>
+        <w:rPr>
+          <w:rtl w:val="0"/>
+        </w:rPr>
+        <w:t xml:space="preserve">Requerimientos funcionales</w:t>
+      </w:r>
+    </w:p>
+    <w:p>
+      <w:pPr>
+        <w:rPr/>
+      </w:pPr>
+      <w:r>
+        <w:rPr>
+          <w:rtl w:val="0"/>
+        </w:rPr>
+      </w:r>
+    </w:p>
+    <w:p>
+      <w:pPr>
+        <w:rPr/>
+      </w:pPr>
+      <w:r>
+        <w:rPr>
+          <w:rtl w:val="0"/>
+        </w:rPr>
+        <w:t xml:space="preserve">RF01. El sistema debe permitir registrar habitaciones.</w:t>
+      </w:r>
+    </w:p>
+    <w:p>
+      <w:pPr>
+        <w:rPr/>
+      </w:pPr>
+      <w:r>
+        <w:rPr>
+          <w:rtl w:val="0"/>
+        </w:rPr>
+        <w:t xml:space="preserve">RF02. El sistema debe permitir listar habitaciones.</w:t>
+      </w:r>
+    </w:p>
+    <w:p>
+      <w:pPr>
+        <w:rPr/>
+      </w:pPr>
+      <w:r>
+        <w:rPr>
+          <w:rtl w:val="0"/>
+        </w:rPr>
+        <w:t xml:space="preserve">RF03. El sistema debe permitir editar habitaciones.</w:t>
+      </w:r>
+    </w:p>
+    <w:p>
+      <w:pPr>
+        <w:rPr/>
+      </w:pPr>
+      <w:r>
+        <w:rPr>
+          <w:rtl w:val="0"/>
+        </w:rPr>
+        <w:t xml:space="preserve">RF04. El sistema debe permitir eliminar habitaciones.</w:t>
+      </w:r>
+    </w:p>
+    <w:p>
+      <w:pPr>
+        <w:rPr/>
+      </w:pPr>
+      <w:r>
+        <w:rPr>
+          <w:rtl w:val="0"/>
+        </w:rPr>
+        <w:t xml:space="preserve">RF05. El sistema debe permitir registrar clientes.</w:t>
+      </w:r>
+    </w:p>
+    <w:p>
+      <w:pPr>
+        <w:rPr/>
+      </w:pPr>
+      <w:r>
+        <w:rPr>
+          <w:rtl w:val="0"/>
+        </w:rPr>
+        <w:t xml:space="preserve">RF06. El sistema debe permitir listar clientes.</w:t>
+      </w:r>
+    </w:p>
+    <w:p>
+      <w:pPr>
+        <w:rPr/>
+      </w:pPr>
+      <w:r>
+        <w:rPr>
+          <w:rtl w:val="0"/>
+        </w:rPr>
+        <w:t xml:space="preserve">RF07. El sistema debe permitir editar clientes.</w:t>
+      </w:r>
+    </w:p>
+    <w:p>
+      <w:pPr>
+        <w:rPr/>
+      </w:pPr>
+      <w:r>
+        <w:rPr>
+          <w:rtl w:val="0"/>
+        </w:rPr>
+        <w:t xml:space="preserve">RF08. El sistema debe permitir eliminar clientes.</w:t>
+      </w:r>
+    </w:p>
+    <w:p>
+      <w:pPr>
+        <w:rPr/>
+      </w:pPr>
+      <w:r>
+        <w:rPr>
+          <w:rtl w:val="0"/>
+        </w:rPr>
+        <w:t xml:space="preserve">RF09. El sistema debe permitir crear reservaciones.</w:t>
+      </w:r>
+    </w:p>
+    <w:p>
+      <w:pPr>
+        <w:rPr/>
+      </w:pPr>
+      <w:r>
+        <w:rPr>
+          <w:rtl w:val="0"/>
+        </w:rPr>
+        <w:t xml:space="preserve">RF10. El sistema debe permitir listar reservaciones.</w:t>
+      </w:r>
+    </w:p>
+    <w:p>
+      <w:pPr>
+        <w:rPr/>
+      </w:pPr>
+      <w:r>
+        <w:rPr>
+          <w:rtl w:val="0"/>
+        </w:rPr>
+        <w:t xml:space="preserve">RF11. El sistema debe permitir editar reservaciones.</w:t>
+      </w:r>
+    </w:p>
+    <w:p>
+      <w:pPr>
+        <w:rPr/>
+      </w:pPr>
+      <w:r>
+        <w:rPr>
+          <w:rtl w:val="0"/>
+        </w:rPr>
+        <w:t xml:space="preserve">RF12. El sistema debe permitir eliminar reservaciones.</w:t>
+      </w:r>
+    </w:p>
+    <w:p>
+      <w:pPr>
+        <w:rPr/>
+      </w:pPr>
+      <w:r>
+        <w:rPr>
+          <w:rtl w:val="0"/>
+        </w:rPr>
+        <w:t xml:space="preserve">RF13. El sistema debe validar que la fecha de salida sea mayor que la fecha de entrada en una reservación.</w:t>
+      </w:r>
+    </w:p>
+    <w:p>
+      <w:pPr>
+        <w:rPr/>
+      </w:pPr>
+      <w:r>
+        <w:rPr>
+          <w:rtl w:val="0"/>
+        </w:rPr>
+      </w:r>
+    </w:p>
+    <w:p>
+      <w:pPr>
+        <w:rPr/>
+      </w:pPr>
+      <w:r>
+        <w:rPr>
+          <w:rtl w:val="0"/>
+        </w:rPr>
+        <w:t xml:space="preserve">Requerimientos no funcionales</w:t>
+      </w:r>
+    </w:p>
+    <w:p>
+      <w:pPr>
+        <w:rPr/>
+      </w:pPr>
+      <w:r>
+        <w:rPr>
+          <w:rtl w:val="0"/>
+        </w:rPr>
+      </w:r>
+    </w:p>
+    <w:p>
+      <w:pPr>
+        <w:rPr/>
+      </w:pPr>
+      <w:r>
+        <w:rPr>
+          <w:rtl w:val="0"/>
+        </w:rPr>
+        <w:t xml:space="preserve">RNF01. El sistema debe presentar una interfaz clara y fácil de usar.</w:t>
+      </w:r>
+    </w:p>
+    <w:p>
+      <w:pPr>
+        <w:rPr/>
+      </w:pPr>
+      <w:r>
+        <w:rPr>
+          <w:rtl w:val="0"/>
+        </w:rPr>
+        <w:t xml:space="preserve">RNF02. El sistema debe ejecutarse correctamente en entorno local.</w:t>
+      </w:r>
+    </w:p>
+    <w:p>
+      <w:pPr>
+        <w:rPr/>
+      </w:pPr>
+      <w:r>
+        <w:rPr>
+          <w:rtl w:val="0"/>
+        </w:rPr>
+        <w:t xml:space="preserve">RNF03. La información debe almacenarse en una base de datos relacional.</w:t>
+      </w:r>
+    </w:p>
+    <w:p>
+      <w:pPr>
+        <w:rPr/>
+      </w:pPr>
+      <w:r>
+        <w:rPr>
+          <w:rtl w:val="0"/>
+        </w:rPr>
+        <w:t xml:space="preserve">RNF04. El sistema debe responder de forma rápida en operaciones básicas.</w:t>
+      </w:r>
+    </w:p>
+    <w:p>
+      <w:pPr>
+        <w:rPr/>
+      </w:pPr>
+      <w:r>
+        <w:rPr>
+          <w:rtl w:val="0"/>
+        </w:rPr>
+        <w:t xml:space="preserve">RNF05. El código del proyecto debe mantenerse organizado y controlado mediante GitHub.</w:t>
+      </w:r>
+    </w:p>
+    <w:p>
+      <w:pPr>
+        <w:rPr/>
+      </w:pPr>
+      <w:r>
+        <w:rPr>
+          <w:rtl w:val="0"/>
+        </w:rPr>
+        <w:t xml:space="preserve">RNF06. El sistema debe permitir su validación mediante pruebas funcionales y automatizadas.</w:t>
+      </w:r>
+    </w:p>
+    <w:p>
+      <w:pPr>
+        <w:rPr/>
+      </w:pPr>
+      <w:r>
+        <w:rPr>
+          <w:rtl w:val="0"/>
+        </w:rPr>
+      </w:r>
+    </w:p>
+    <w:p>
+      <w:pPr>
+        <w:pStyle w:val="Heading2"/>
+        <w:keepNext w:val="0"/>
+        <w:keepLines w:val="0"/>
+        <w:spacing w:after="80" w:lineRule="auto"/>
+        <w:rPr>
+          <w:b w:val="1"/>
+          <w:bCs w:val="1"/>
+          <w:sz w:val="34"/>
+          <w:szCs w:val="34"/>
+        </w:rPr>
+      </w:pPr>
+      <w:bookmarkStart w:colFirst="0" w:colLast="0" w:name="_x0uidzyjbmn8" w:id="10"/>
+      <w:bookmarkEnd w:id="10"/>
+      <w:r>
+        <w:rPr>
+          <w:b w:val="1"/>
+          <w:bCs w:val="1"/>
+          <w:sz w:val="34"/>
+          <w:szCs w:val="34"/>
+          <w:rtl w:val="0"/>
+        </w:rPr>
+        <w:t xml:space="preserve">4.2 Criterios de aceptación y rechazo de pruebas</w:t>
+      </w:r>
+    </w:p>
+    <w:p>
+      <w:pPr>
+        <w:rPr/>
+      </w:pPr>
+      <w:r>
+        <w:rPr>
+          <w:rtl w:val="0"/>
+        </w:rPr>
+        <w:t xml:space="preserve">Criterios de aceptación</w:t>
+      </w:r>
+    </w:p>
+    <w:p>
+      <w:pPr>
+        <w:rPr/>
+      </w:pPr>
+      <w:r>
+        <w:rPr>
+          <w:rtl w:val="0"/>
+        </w:rPr>
+      </w:r>
+    </w:p>
+    <w:p>
+      <w:pPr>
+        <w:rPr/>
+      </w:pPr>
+      <w:r>
+        <w:rPr>
+          <w:rtl w:val="0"/>
+        </w:rPr>
+        <w:t xml:space="preserve">- La funcionalidad evaluada realiza correctamente la operación esperada.</w:t>
+      </w:r>
+    </w:p>
+    <w:p>
+      <w:pPr>
+        <w:rPr/>
+      </w:pPr>
+      <w:r>
+        <w:rPr>
+          <w:rtl w:val="0"/>
+        </w:rPr>
+        <w:t xml:space="preserve">- Los datos se guardan de forma correcta en la base de datos.</w:t>
+      </w:r>
+    </w:p>
+    <w:p>
+      <w:pPr>
+        <w:rPr/>
+      </w:pPr>
+      <w:r>
+        <w:rPr>
+          <w:rtl w:val="0"/>
+        </w:rPr>
+        <w:t xml:space="preserve">- El sistema muestra mensajes o resultados coherentes con la acción ejecutada.</w:t>
+      </w:r>
+    </w:p>
+    <w:p>
+      <w:pPr>
+        <w:rPr/>
+      </w:pPr>
+      <w:r>
+        <w:rPr>
+          <w:rtl w:val="0"/>
+        </w:rPr>
+        <w:t xml:space="preserve">- No se permiten datos inválidos en campos obligatorios.</w:t>
+      </w:r>
+    </w:p>
+    <w:p>
+      <w:pPr>
+        <w:rPr/>
+      </w:pPr>
+      <w:r>
+        <w:rPr>
+          <w:rtl w:val="0"/>
+        </w:rPr>
+        <w:t xml:space="preserve">- Las vistas de listado muestran correctamente la información registrada.</w:t>
+      </w:r>
+    </w:p>
+    <w:p>
+      <w:pPr>
+        <w:rPr/>
+      </w:pPr>
+      <w:r>
+        <w:rPr>
+          <w:rtl w:val="0"/>
+        </w:rPr>
+        <w:t xml:space="preserve">- Las operaciones de crear, editar, consultar y eliminar funcionan sin errores.</w:t>
+      </w:r>
+    </w:p>
+    <w:p>
+      <w:pPr>
+        <w:rPr/>
+      </w:pPr>
+      <w:r>
+        <w:rPr>
+          <w:rtl w:val="0"/>
+        </w:rPr>
+      </w:r>
+    </w:p>
+    <w:p>
+      <w:pPr>
+        <w:rPr/>
+      </w:pPr>
+      <w:r>
+        <w:rPr>
+          <w:rtl w:val="0"/>
+        </w:rPr>
+        <w:t xml:space="preserve">Criterios de rechazo</w:t>
+      </w:r>
+    </w:p>
+    <w:p>
+      <w:pPr>
+        <w:rPr/>
+      </w:pPr>
+      <w:r>
+        <w:rPr>
+          <w:rtl w:val="0"/>
+        </w:rPr>
+      </w:r>
+    </w:p>
+    <w:p>
+      <w:pPr>
+        <w:rPr/>
+      </w:pPr>
+      <w:r>
+        <w:rPr>
+          <w:rtl w:val="0"/>
+        </w:rPr>
+        <w:t xml:space="preserve">- El sistema no guarda la información introducida.</w:t>
+      </w:r>
+    </w:p>
+    <w:p>
+      <w:pPr>
+        <w:rPr/>
+      </w:pPr>
+      <w:r>
+        <w:rPr>
+          <w:rtl w:val="0"/>
+        </w:rPr>
+        <w:t xml:space="preserve">- La funcionalidad presenta errores al crear, editar, eliminar o consultar datos.</w:t>
+      </w:r>
+    </w:p>
+    <w:p>
+      <w:pPr>
+        <w:rPr/>
+      </w:pPr>
+      <w:r>
+        <w:rPr>
+          <w:rtl w:val="0"/>
+        </w:rPr>
+        <w:t xml:space="preserve">- Se permiten valores inválidos en campos obligatorios.</w:t>
+      </w:r>
+    </w:p>
+    <w:p>
+      <w:pPr>
+        <w:rPr/>
+      </w:pPr>
+      <w:r>
+        <w:rPr>
+          <w:rtl w:val="0"/>
+        </w:rPr>
+        <w:t xml:space="preserve">- El sistema muestra páginas de error durante el flujo normal.</w:t>
+      </w:r>
+    </w:p>
+    <w:p>
+      <w:pPr>
+        <w:rPr/>
+      </w:pPr>
+      <w:r>
+        <w:rPr>
+          <w:rtl w:val="0"/>
+        </w:rPr>
+        <w:t xml:space="preserve">- La información no aparece reflejada correctamente en los listados.</w:t>
+      </w:r>
+    </w:p>
+    <w:p>
+      <w:pPr>
+        <w:rPr/>
+      </w:pPr>
+      <w:r>
+        <w:rPr>
+          <w:rtl w:val="0"/>
+        </w:rPr>
+        <w:t xml:space="preserve">- La validación de fechas en reservaciones no funciona correctamente.</w:t>
+      </w:r>
+    </w:p>
+    <w:p>
+      <w:pPr>
+        <w:rPr/>
+      </w:pPr>
+      <w:r>
+        <w:rPr>
+          <w:rtl w:val="0"/>
+        </w:rPr>
+      </w:r>
+    </w:p>
+    <w:p>
+      <w:pPr>
+        <w:pStyle w:val="Heading2"/>
+        <w:keepNext w:val="0"/>
+        <w:keepLines w:val="0"/>
+        <w:spacing w:after="80" w:lineRule="auto"/>
+        <w:rPr>
+          <w:b w:val="1"/>
+          <w:bCs w:val="1"/>
+          <w:sz w:val="34"/>
+          <w:szCs w:val="34"/>
+        </w:rPr>
+      </w:pPr>
+      <w:bookmarkStart w:colFirst="0" w:colLast="0" w:name="_9ewr7jeyf9bs" w:id="11"/>
+      <w:bookmarkEnd w:id="11"/>
+      <w:r>
+        <w:rPr>
+          <w:b w:val="1"/>
+          <w:bCs w:val="1"/>
+          <w:sz w:val="34"/>
+          <w:szCs w:val="34"/>
+          <w:rtl w:val="0"/>
+        </w:rPr>
+        <w:t xml:space="preserve">4.3 Herramientas de pruebas</w:t>
+      </w:r>
+    </w:p>
+    <w:p>
+      <w:pPr>
+        <w:rPr/>
+      </w:pPr>
+      <w:r>
+        <w:rPr>
+          <w:rtl w:val="0"/>
+        </w:rPr>
+        <w:t xml:space="preserve">Para la validación del sistema se utilizarán las siguientes herramientas:</w:t>
+      </w:r>
+    </w:p>
+    <w:p>
+      <w:pPr>
+        <w:rPr/>
+      </w:pPr>
+      <w:r>
+        <w:rPr>
+          <w:rtl w:val="0"/>
+        </w:rPr>
+      </w:r>
+    </w:p>
+    <w:p>
+      <w:pPr>
+        <w:rPr/>
+      </w:pPr>
+      <w:r>
+        <w:rPr>
+          <w:rtl w:val="0"/>
+        </w:rPr>
+        <w:t xml:space="preserve">- Visual Studio: utilizado para ejecutar y depurar el proyecto.</w:t>
+      </w:r>
+    </w:p>
+    <w:p>
+      <w:pPr>
+        <w:rPr/>
+      </w:pPr>
+      <w:r>
+        <w:rPr>
+          <w:rtl w:val="0"/>
+        </w:rPr>
+        <w:t xml:space="preserve">- SQL Server / LocalDB: utilizado para verificar el almacenamiento correcto de la información.</w:t>
+      </w:r>
+    </w:p>
+    <w:p>
+      <w:pPr>
+        <w:rPr/>
+      </w:pPr>
+      <w:r>
+        <w:rPr>
+          <w:rtl w:val="0"/>
+        </w:rPr>
+        <w:t xml:space="preserve">- Navegador web: utilizado para ejecutar pruebas funcionales manuales sobre la interfaz.</w:t>
+      </w:r>
+    </w:p>
+    <w:p>
+      <w:pPr>
+        <w:rPr/>
+      </w:pPr>
+      <w:r>
+        <w:rPr>
+          <w:rtl w:val="0"/>
+        </w:rPr>
+        <w:t xml:space="preserve">- Selenium WebDriver con C#: utilizado para automatizar flujos básicos del sistema.</w:t>
+      </w:r>
+    </w:p>
+    <w:p>
+      <w:pPr>
+        <w:rPr/>
+      </w:pPr>
+      <w:r>
+        <w:rPr>
+          <w:rtl w:val="0"/>
+        </w:rPr>
+        <w:t xml:space="preserve">- GitHub: utilizado para mantener trazabilidad de cambios y versiones del proyecto.</w:t>
+      </w:r>
+    </w:p>
+    <w:p>
+      <w:pPr>
+        <w:rPr/>
+      </w:pPr>
+      <w:r>
+        <w:rPr>
+          <w:rtl w:val="0"/>
+        </w:rPr>
+        <w:t xml:space="preserve">- Jira: utilizado para registrar historias de usuario y dar seguimiento al progreso del trabajo.</w:t>
+      </w:r>
+    </w:p>
+    <w:p>
+      <w:pPr>
+        <w:rPr/>
+      </w:pPr>
+      <w:r>
+        <w:rPr>
+          <w:rtl w:val="0"/>
+        </w:rPr>
+      </w:r>
+    </w:p>
+    <w:p>
+      <w:pPr>
+        <w:rPr/>
+      </w:pPr>
+      <w:r>
+        <w:rPr>
+          <w:rtl w:val="0"/>
+        </w:rPr>
+        <w:t xml:space="preserve">La elección de estas herramientas permite combinar pruebas manuales y automatizadas, validar el comportamiento visual del sistema y comprobar el almacenamiento correcto de datos.</w:t>
+      </w:r>
+    </w:p>
+    <w:p>
+      <w:pPr>
+        <w:rPr/>
+      </w:pPr>
+      <w:r>
+        <w:rPr>
+          <w:rtl w:val="0"/>
+        </w:rPr>
+      </w:r>
+    </w:p>
+    <w:p>
+      <w:pPr>
+        <w:pStyle w:val="Heading2"/>
+        <w:keepNext w:val="0"/>
+        <w:keepLines w:val="0"/>
+        <w:spacing w:after="80" w:lineRule="auto"/>
+        <w:rPr>
+          <w:b w:val="1"/>
+          <w:bCs w:val="1"/>
+          <w:sz w:val="34"/>
+          <w:szCs w:val="34"/>
+        </w:rPr>
+      </w:pPr>
+      <w:bookmarkStart w:colFirst="0" w:colLast="0" w:name="_r45dxqkobslo" w:id="12"/>
+      <w:bookmarkEnd w:id="12"/>
+      <w:r>
+        <w:rPr>
+          <w:b w:val="1"/>
+          <w:bCs w:val="1"/>
+          <w:sz w:val="34"/>
+          <w:szCs w:val="34"/>
+          <w:rtl w:val="0"/>
+        </w:rPr>
+        <w:t xml:space="preserve">4.4 Cronograma de ejecución de pruebas</w:t>
+      </w:r>
+    </w:p>
+    <w:p>
+      <w:pPr>
+        <w:spacing w:after="240" w:before="240" w:lineRule="auto"/>
+        <w:rPr/>
+      </w:pPr>
+      <w:r>
+        <w:rPr>
+          <w:rtl w:val="0"/>
+        </w:rPr>
+        <w:t xml:space="preserve">Pon esta tabla en Word:</w:t>
+      </w:r>
+    </w:p>
+    <w:tbl>
+      <w:tblPr>
+        <w:tblStyle w:val="Table3"/>
+        <w:tblW w:w="8855.0" w:type="dxa"/>
+        <w:jc w:val="left"/>
+        <w:tblBorders>
+          <w:top w:color="000000" w:space="0" w:sz="0" w:val="nil"/>
+          <w:left w:color="000000" w:space="0" w:sz="0" w:val="nil"/>
+          <w:bottom w:color="000000" w:space="0" w:sz="0" w:val="nil"/>
+          <w:right w:color="000000" w:space="0" w:sz="0" w:val="nil"/>
+          <w:insideH w:color="000000" w:space="0" w:sz="0" w:val="nil"/>
+          <w:insideV w:color="000000" w:space="0" w:sz="0" w:val="nil"/>
+        </w:tblBorders>
+        <w:tblLayout w:type="fixed"/>
+        <w:tblLook w:val="0600"/>
+      </w:tblPr>
+      <w:tblGrid>
+        <w:gridCol w:w="3935"/>
+        <w:gridCol w:w="1325"/>
+        <w:gridCol w:w="1805"/>
+        <w:gridCol w:w="1790"/>
+        <w:tblGridChange w:id="0">
+          <w:tblGrid>
+            <w:gridCol w:w="3935"/>
+            <w:gridCol w:w="1325"/>
+            <w:gridCol w:w="1805"/>
+            <w:gridCol w:w="1790"/>
+          </w:tblGrid>
+        </w:tblGridChange>
+      </w:tblGrid>
+      <w:tr>
+        <w:trPr>
+          <w:cantSplit w:val="0"/>
+          <w:trHeight w:val="500" w:hRule="atLeast"/>
+          <w:tblHeader w:val="0"/>
+        </w:trPr>
+        <w:tc>
+          <w:tcPr>
+            <w:tcBorders>
+              <w:top w:color="000000" w:space="0" w:sz="0" w:val="nil"/>
+              <w:left w:color="000000" w:space="0" w:sz="0" w:val="nil"/>
+              <w:bottom w:color="000000" w:space="0" w:sz="0" w:val="nil"/>
+              <w:right w:color="000000" w:space="0" w:sz="0" w:val="nil"/>
+            </w:tcBorders>
+            <w:tcMar>
+              <w:top w:w="100.0" w:type="dxa"/>
+              <w:left w:w="100.0" w:type="dxa"/>
+              <w:bottom w:w="100.0" w:type="dxa"/>
+              <w:right w:w="100.0" w:type="dxa"/>
+            </w:tcMar>
+            <w:vAlign w:val="top"/>
+          </w:tcPr>
+          <w:p>
+            <w:pPr>
+              <w:jc w:val="center"/>
+              <w:rPr/>
+            </w:pPr>
+            <w:r>
+              <w:rPr>
+                <w:b w:val="1"/>
+                <w:bCs w:val="1"/>
+                <w:rtl w:val="0"/>
+              </w:rPr>
+              <w:t xml:space="preserve">Actividad de prueba</w:t>
+            </w:r>
+            <w:r>
+              <w:rPr>
+                <w:rtl w:val="0"/>
+              </w:rPr>
+            </w:r>
+          </w:p>
+        </w:tc>
+        <w:tc>
+          <w:tcPr>
+            <w:tcBorders>
+              <w:top w:color="000000" w:space="0" w:sz="0" w:val="nil"/>
+              <w:left w:color="000000" w:space="0" w:sz="0" w:val="nil"/>
+              <w:bottom w:color="000000" w:space="0" w:sz="0" w:val="nil"/>
+              <w:right w:color="000000" w:space="0" w:sz="0" w:val="nil"/>
+            </w:tcBorders>
+            <w:tcMar>
+              <w:top w:w="100.0" w:type="dxa"/>
+              <w:left w:w="100.0" w:type="dxa"/>
+              <w:bottom w:w="100.0" w:type="dxa"/>
+              <w:right w:w="100.0" w:type="dxa"/>
+            </w:tcMar>
+            <w:vAlign w:val="top"/>
+          </w:tcPr>
+          <w:p>
+            <w:pPr>
+              <w:jc w:val="center"/>
+              <w:rPr/>
+            </w:pPr>
+            <w:r>
+              <w:rPr>
+                <w:b w:val="1"/>
+                <w:bCs w:val="1"/>
+                <w:rtl w:val="0"/>
+              </w:rPr>
+              <w:t xml:space="preserve">Fecha</w:t>
+            </w:r>
+            <w:r>
+              <w:rPr>
+                <w:rtl w:val="0"/>
+              </w:rPr>
+            </w:r>
+          </w:p>
+        </w:tc>
+        <w:tc>
+          <w:tcPr>
+            <w:tcBorders>
+              <w:top w:color="000000" w:space="0" w:sz="0" w:val="nil"/>
+              <w:left w:color="000000" w:space="0" w:sz="0" w:val="nil"/>
+              <w:bottom w:color="000000" w:space="0" w:sz="0" w:val="nil"/>
+              <w:right w:color="000000" w:space="0" w:sz="0" w:val="nil"/>
+            </w:tcBorders>
+            <w:tcMar>
+              <w:top w:w="100.0" w:type="dxa"/>
+              <w:left w:w="100.0" w:type="dxa"/>
+              <w:bottom w:w="100.0" w:type="dxa"/>
+              <w:right w:w="100.0" w:type="dxa"/>
+            </w:tcMar>
+            <w:vAlign w:val="top"/>
+          </w:tcPr>
+          <w:p>
+            <w:pPr>
+              <w:jc w:val="center"/>
+              <w:rPr/>
+            </w:pPr>
+            <w:r>
+              <w:rPr>
+                <w:b w:val="1"/>
+                <w:bCs w:val="1"/>
+                <w:rtl w:val="0"/>
+              </w:rPr>
+              <w:t xml:space="preserve">Tipo de prueba</w:t>
+            </w:r>
+            <w:r>
+              <w:rPr>
+                <w:rtl w:val="0"/>
+              </w:rPr>
+            </w:r>
+          </w:p>
+        </w:tc>
+        <w:tc>
+          <w:tcPr>
+            <w:tcBorders>
+              <w:top w:color="000000" w:space="0" w:sz="0" w:val="nil"/>
+              <w:left w:color="000000" w:space="0" w:sz="0" w:val="nil"/>
+              <w:bottom w:color="000000" w:space="0" w:sz="0" w:val="nil"/>
+              <w:right w:color="000000" w:space="0" w:sz="0" w:val="nil"/>
+            </w:tcBorders>
+            <w:tcMar>
+              <w:top w:w="100.0" w:type="dxa"/>
+              <w:left w:w="100.0" w:type="dxa"/>
+              <w:bottom w:w="100.0" w:type="dxa"/>
+              <w:right w:w="100.0" w:type="dxa"/>
+            </w:tcMar>
+            <w:vAlign w:val="top"/>
+          </w:tcPr>
+          <w:p>
+            <w:pPr>
+              <w:jc w:val="center"/>
+              <w:rPr/>
+            </w:pPr>
+            <w:r>
+              <w:rPr>
+                <w:b w:val="1"/>
+                <w:bCs w:val="1"/>
+                <w:rtl w:val="0"/>
+              </w:rPr>
+              <w:t xml:space="preserve">Responsable</w:t>
+            </w:r>
+            <w:r>
+              <w:rPr>
+                <w:rtl w:val="0"/>
+              </w:rPr>
+            </w:r>
+          </w:p>
+        </w:tc>
+      </w:tr>
+      <w:tr>
+        <w:trPr>
+          <w:cantSplit w:val="0"/>
+          <w:trHeight w:val="500" w:hRule="atLeast"/>
+          <w:tblHeader w:val="0"/>
+        </w:trPr>
+        <w:tc>
+          <w:tcPr>
+            <w:tcBorders>
+              <w:top w:color="000000" w:space="0" w:sz="0" w:val="nil"/>
+              <w:left w:color="000000" w:space="0" w:sz="0" w:val="nil"/>
+              <w:bottom w:color="000000" w:space="0" w:sz="0" w:val="nil"/>
+              <w:right w:color="000000" w:space="0" w:sz="0" w:val="nil"/>
+            </w:tcBorders>
+            <w:tcMar>
+              <w:top w:w="100.0" w:type="dxa"/>
+              <w:left w:w="100.0" w:type="dxa"/>
+              <w:bottom w:w="100.0" w:type="dxa"/>
+              <w:right w:w="100.0" w:type="dxa"/>
+            </w:tcMar>
+            <w:vAlign w:val="top"/>
+          </w:tcPr>
+          <w:p>
+            <w:pPr>
+              <w:rPr/>
+            </w:pPr>
+            <w:r>
+              <w:rPr>
+                <w:rtl w:val="0"/>
+              </w:rPr>
+              <w:t xml:space="preserve">Diseño de casos de prueba</w:t>
+            </w:r>
+          </w:p>
+        </w:tc>
+        <w:tc>
+          <w:tcPr>
+            <w:tcBorders>
+              <w:top w:color="000000" w:space="0" w:sz="0" w:val="nil"/>
+              <w:left w:color="000000" w:space="0" w:sz="0" w:val="nil"/>
+              <w:bottom w:color="000000" w:space="0" w:sz="0" w:val="nil"/>
+              <w:right w:color="000000" w:space="0" w:sz="0" w:val="nil"/>
+            </w:tcBorders>
+            <w:tcMar>
+              <w:top w:w="100.0" w:type="dxa"/>
+              <w:left w:w="100.0" w:type="dxa"/>
+              <w:bottom w:w="100.0" w:type="dxa"/>
+              <w:right w:w="100.0" w:type="dxa"/>
+            </w:tcMar>
+            <w:vAlign w:val="top"/>
+          </w:tcPr>
+          <w:p>
+            <w:pPr>
+              <w:rPr/>
+            </w:pPr>
+            <w:r>
+              <w:rPr>
+                <w:rtl w:val="0"/>
+              </w:rPr>
+              <w:t xml:space="preserve">14/04/2026</w:t>
+            </w:r>
+          </w:p>
+        </w:tc>
+        <w:tc>
+          <w:tcPr>
+            <w:tcBorders>
+              <w:top w:color="000000" w:space="0" w:sz="0" w:val="nil"/>
+              <w:left w:color="000000" w:space="0" w:sz="0" w:val="nil"/>
+              <w:bottom w:color="000000" w:space="0" w:sz="0" w:val="nil"/>
+              <w:right w:color="000000" w:space="0" w:sz="0" w:val="nil"/>
+            </w:tcBorders>
+            <w:tcMar>
+              <w:top w:w="100.0" w:type="dxa"/>
+              <w:left w:w="100.0" w:type="dxa"/>
+              <w:bottom w:w="100.0" w:type="dxa"/>
+              <w:right w:w="100.0" w:type="dxa"/>
+            </w:tcMar>
+            <w:vAlign w:val="top"/>
+          </w:tcPr>
+          <w:p>
+            <w:pPr>
+              <w:rPr/>
+            </w:pPr>
+            <w:r>
+              <w:rPr>
+                <w:rtl w:val="0"/>
+              </w:rPr>
+              <w:t xml:space="preserve">Planificación</w:t>
+            </w:r>
+          </w:p>
+        </w:tc>
+        <w:tc>
+          <w:tcPr>
+            <w:tcBorders>
+              <w:top w:color="000000" w:space="0" w:sz="0" w:val="nil"/>
+              <w:left w:color="000000" w:space="0" w:sz="0" w:val="nil"/>
+              <w:bottom w:color="000000" w:space="0" w:sz="0" w:val="nil"/>
+              <w:right w:color="000000" w:space="0" w:sz="0" w:val="nil"/>
+            </w:tcBorders>
+            <w:tcMar>
+              <w:top w:w="100.0" w:type="dxa"/>
+              <w:left w:w="100.0" w:type="dxa"/>
+              <w:bottom w:w="100.0" w:type="dxa"/>
+              <w:right w:w="100.0" w:type="dxa"/>
+            </w:tcMar>
+            <w:vAlign w:val="top"/>
+          </w:tcPr>
+          <w:p>
+            <w:pPr>
+              <w:rPr/>
+            </w:pPr>
+            <w:r>
+              <w:rPr>
+                <w:rtl w:val="0"/>
+              </w:rPr>
+              <w:t xml:space="preserve">Raymel Guerrero</w:t>
+            </w:r>
+          </w:p>
+        </w:tc>
+      </w:tr>
+      <w:tr>
+        <w:trPr>
+          <w:cantSplit w:val="0"/>
+          <w:trHeight w:val="500" w:hRule="atLeast"/>
+          <w:tblHeader w:val="0"/>
+        </w:trPr>
+        <w:tc>
+          <w:tcPr>
+            <w:tcBorders>
+              <w:top w:color="000000" w:space="0" w:sz="0" w:val="nil"/>
+              <w:left w:color="000000" w:space="0" w:sz="0" w:val="nil"/>
+              <w:bottom w:color="000000" w:space="0" w:sz="0" w:val="nil"/>
+              <w:right w:color="000000" w:space="0" w:sz="0" w:val="nil"/>
+            </w:tcBorders>
+            <w:tcMar>
+              <w:top w:w="100.0" w:type="dxa"/>
+              <w:left w:w="100.0" w:type="dxa"/>
+              <w:bottom w:w="100.0" w:type="dxa"/>
+              <w:right w:w="100.0" w:type="dxa"/>
+            </w:tcMar>
+            <w:vAlign w:val="top"/>
+          </w:tcPr>
+          <w:p>
+            <w:pPr>
+              <w:rPr/>
+            </w:pPr>
+            <w:r>
+              <w:rPr>
+                <w:rtl w:val="0"/>
+              </w:rPr>
+              <w:t xml:space="preserve">Ejecución de pruebas de habitaciones</w:t>
+            </w:r>
+          </w:p>
+        </w:tc>
+        <w:tc>
+          <w:tcPr>
+            <w:tcBorders>
+              <w:top w:color="000000" w:space="0" w:sz="0" w:val="nil"/>
+              <w:left w:color="000000" w:space="0" w:sz="0" w:val="nil"/>
+              <w:bottom w:color="000000" w:space="0" w:sz="0" w:val="nil"/>
+              <w:right w:color="000000" w:space="0" w:sz="0" w:val="nil"/>
+            </w:tcBorders>
+            <w:tcMar>
+              <w:top w:w="100.0" w:type="dxa"/>
+              <w:left w:w="100.0" w:type="dxa"/>
+              <w:bottom w:w="100.0" w:type="dxa"/>
+              <w:right w:w="100.0" w:type="dxa"/>
+            </w:tcMar>
+            <w:vAlign w:val="top"/>
+          </w:tcPr>
+          <w:p>
+            <w:pPr>
+              <w:rPr/>
+            </w:pPr>
+            <w:r>
+              <w:rPr>
+                <w:rtl w:val="0"/>
+              </w:rPr>
+              <w:t xml:space="preserve">14/04/2026</w:t>
+            </w:r>
+          </w:p>
+        </w:tc>
+        <w:tc>
+          <w:tcPr>
+            <w:tcBorders>
+              <w:top w:color="000000" w:space="0" w:sz="0" w:val="nil"/>
+              <w:left w:color="000000" w:space="0" w:sz="0" w:val="nil"/>
+              <w:bottom w:color="000000" w:space="0" w:sz="0" w:val="nil"/>
+              <w:right w:color="000000" w:space="0" w:sz="0" w:val="nil"/>
+            </w:tcBorders>
+            <w:tcMar>
+              <w:top w:w="100.0" w:type="dxa"/>
+              <w:left w:w="100.0" w:type="dxa"/>
+              <w:bottom w:w="100.0" w:type="dxa"/>
+              <w:right w:w="100.0" w:type="dxa"/>
+            </w:tcMar>
+            <w:vAlign w:val="top"/>
+          </w:tcPr>
+          <w:p>
+            <w:pPr>
+              <w:rPr/>
+            </w:pPr>
+            <w:r>
+              <w:rPr>
+                <w:rtl w:val="0"/>
+              </w:rPr>
+              <w:t xml:space="preserve">Manual</w:t>
+            </w:r>
+          </w:p>
+        </w:tc>
+        <w:tc>
+          <w:tcPr>
+            <w:tcBorders>
+              <w:top w:color="000000" w:space="0" w:sz="0" w:val="nil"/>
+              <w:left w:color="000000" w:space="0" w:sz="0" w:val="nil"/>
+              <w:bottom w:color="000000" w:space="0" w:sz="0" w:val="nil"/>
+              <w:right w:color="000000" w:space="0" w:sz="0" w:val="nil"/>
+            </w:tcBorders>
+            <w:tcMar>
+              <w:top w:w="100.0" w:type="dxa"/>
+              <w:left w:w="100.0" w:type="dxa"/>
+              <w:bottom w:w="100.0" w:type="dxa"/>
+              <w:right w:w="100.0" w:type="dxa"/>
+            </w:tcMar>
+            <w:vAlign w:val="top"/>
+          </w:tcPr>
+          <w:p>
+            <w:pPr>
+              <w:rPr/>
+            </w:pPr>
+            <w:r>
+              <w:rPr>
+                <w:rtl w:val="0"/>
+              </w:rPr>
+              <w:t xml:space="preserve">Raymel Guerrero</w:t>
+            </w:r>
+          </w:p>
+        </w:tc>
+      </w:tr>
+      <w:tr>
+        <w:trPr>
+          <w:cantSplit w:val="0"/>
+          <w:trHeight w:val="500" w:hRule="atLeast"/>
+          <w:tblHeader w:val="0"/>
+        </w:trPr>
+        <w:tc>
+          <w:tcPr>
+            <w:tcBorders>
+              <w:top w:color="000000" w:space="0" w:sz="0" w:val="nil"/>
+              <w:left w:color="000000" w:space="0" w:sz="0" w:val="nil"/>
+              <w:bottom w:color="000000" w:space="0" w:sz="0" w:val="nil"/>
+              <w:right w:color="000000" w:space="0" w:sz="0" w:val="nil"/>
+            </w:tcBorders>
+            <w:tcMar>
+              <w:top w:w="100.0" w:type="dxa"/>
+              <w:left w:w="100.0" w:type="dxa"/>
+              <w:bottom w:w="100.0" w:type="dxa"/>
+              <w:right w:w="100.0" w:type="dxa"/>
+            </w:tcMar>
+            <w:vAlign w:val="top"/>
+          </w:tcPr>
+          <w:p>
+            <w:pPr>
+              <w:rPr/>
+            </w:pPr>
+            <w:r>
+              <w:rPr>
+                <w:rtl w:val="0"/>
+              </w:rPr>
+              <w:t xml:space="preserve">Ejecución de pruebas de clientes</w:t>
+            </w:r>
+          </w:p>
+        </w:tc>
+        <w:tc>
+          <w:tcPr>
+            <w:tcBorders>
+              <w:top w:color="000000" w:space="0" w:sz="0" w:val="nil"/>
+              <w:left w:color="000000" w:space="0" w:sz="0" w:val="nil"/>
+              <w:bottom w:color="000000" w:space="0" w:sz="0" w:val="nil"/>
+              <w:right w:color="000000" w:space="0" w:sz="0" w:val="nil"/>
+            </w:tcBorders>
+            <w:tcMar>
+              <w:top w:w="100.0" w:type="dxa"/>
+              <w:left w:w="100.0" w:type="dxa"/>
+              <w:bottom w:w="100.0" w:type="dxa"/>
+              <w:right w:w="100.0" w:type="dxa"/>
+            </w:tcMar>
+            <w:vAlign w:val="top"/>
+          </w:tcPr>
+          <w:p>
+            <w:pPr>
+              <w:rPr/>
+            </w:pPr>
+            <w:r>
+              <w:rPr>
+                <w:rtl w:val="0"/>
+              </w:rPr>
+              <w:t xml:space="preserve">14/04/2026</w:t>
+            </w:r>
+          </w:p>
+        </w:tc>
+        <w:tc>
+          <w:tcPr>
+            <w:tcBorders>
+              <w:top w:color="000000" w:space="0" w:sz="0" w:val="nil"/>
+              <w:left w:color="000000" w:space="0" w:sz="0" w:val="nil"/>
+              <w:bottom w:color="000000" w:space="0" w:sz="0" w:val="nil"/>
+              <w:right w:color="000000" w:space="0" w:sz="0" w:val="nil"/>
+            </w:tcBorders>
+            <w:tcMar>
+              <w:top w:w="100.0" w:type="dxa"/>
+              <w:left w:w="100.0" w:type="dxa"/>
+              <w:bottom w:w="100.0" w:type="dxa"/>
+              <w:right w:w="100.0" w:type="dxa"/>
+            </w:tcMar>
+            <w:vAlign w:val="top"/>
+          </w:tcPr>
+          <w:p>
+            <w:pPr>
+              <w:rPr/>
+            </w:pPr>
+            <w:r>
+              <w:rPr>
+                <w:rtl w:val="0"/>
+              </w:rPr>
+              <w:t xml:space="preserve">Manual</w:t>
+            </w:r>
+          </w:p>
+        </w:tc>
+        <w:tc>
+          <w:tcPr>
+            <w:tcBorders>
+              <w:top w:color="000000" w:space="0" w:sz="0" w:val="nil"/>
+              <w:left w:color="000000" w:space="0" w:sz="0" w:val="nil"/>
+              <w:bottom w:color="000000" w:space="0" w:sz="0" w:val="nil"/>
+              <w:right w:color="000000" w:space="0" w:sz="0" w:val="nil"/>
+            </w:tcBorders>
+            <w:tcMar>
+              <w:top w:w="100.0" w:type="dxa"/>
+              <w:left w:w="100.0" w:type="dxa"/>
+              <w:bottom w:w="100.0" w:type="dxa"/>
+              <w:right w:w="100.0" w:type="dxa"/>
+            </w:tcMar>
+            <w:vAlign w:val="top"/>
+          </w:tcPr>
+          <w:p>
+            <w:pPr>
+              <w:rPr/>
+            </w:pPr>
+            <w:r>
+              <w:rPr>
+                <w:rtl w:val="0"/>
+              </w:rPr>
+              <w:t xml:space="preserve">Raymel Guerrero</w:t>
+            </w:r>
+          </w:p>
+        </w:tc>
+      </w:tr>
+      <w:tr>
+        <w:trPr>
+          <w:cantSplit w:val="0"/>
+          <w:trHeight w:val="500" w:hRule="atLeast"/>
+          <w:tblHeader w:val="0"/>
+        </w:trPr>
+        <w:tc>
+          <w:tcPr>
+            <w:tcBorders>
+              <w:top w:color="000000" w:space="0" w:sz="0" w:val="nil"/>
+              <w:left w:color="000000" w:space="0" w:sz="0" w:val="nil"/>
+              <w:bottom w:color="000000" w:space="0" w:sz="0" w:val="nil"/>
+              <w:right w:color="000000" w:space="0" w:sz="0" w:val="nil"/>
+            </w:tcBorders>
+            <w:tcMar>
+              <w:top w:w="100.0" w:type="dxa"/>
+              <w:left w:w="100.0" w:type="dxa"/>
+              <w:bottom w:w="100.0" w:type="dxa"/>
+              <w:right w:w="100.0" w:type="dxa"/>
+            </w:tcMar>
+            <w:vAlign w:val="top"/>
+          </w:tcPr>
+          <w:p>
+            <w:pPr>
+              <w:rPr/>
+            </w:pPr>
+            <w:r>
+              <w:rPr>
+                <w:rtl w:val="0"/>
+              </w:rPr>
+              <w:t xml:space="preserve">Ejecución de pruebas de reservaciones</w:t>
+            </w:r>
+          </w:p>
+        </w:tc>
+        <w:tc>
+          <w:tcPr>
+            <w:tcBorders>
+              <w:top w:color="000000" w:space="0" w:sz="0" w:val="nil"/>
+              <w:left w:color="000000" w:space="0" w:sz="0" w:val="nil"/>
+              <w:bottom w:color="000000" w:space="0" w:sz="0" w:val="nil"/>
+              <w:right w:color="000000" w:space="0" w:sz="0" w:val="nil"/>
+            </w:tcBorders>
+            <w:tcMar>
+              <w:top w:w="100.0" w:type="dxa"/>
+              <w:left w:w="100.0" w:type="dxa"/>
+              <w:bottom w:w="100.0" w:type="dxa"/>
+              <w:right w:w="100.0" w:type="dxa"/>
+            </w:tcMar>
+            <w:vAlign w:val="top"/>
+          </w:tcPr>
+          <w:p>
+            <w:pPr>
+              <w:rPr/>
+            </w:pPr>
+            <w:r>
+              <w:rPr>
+                <w:rtl w:val="0"/>
+              </w:rPr>
+              <w:t xml:space="preserve">15/04/2026</w:t>
+            </w:r>
+          </w:p>
+        </w:tc>
+        <w:tc>
+          <w:tcPr>
+            <w:tcBorders>
+              <w:top w:color="000000" w:space="0" w:sz="0" w:val="nil"/>
+              <w:left w:color="000000" w:space="0" w:sz="0" w:val="nil"/>
+              <w:bottom w:color="000000" w:space="0" w:sz="0" w:val="nil"/>
+              <w:right w:color="000000" w:space="0" w:sz="0" w:val="nil"/>
+            </w:tcBorders>
+            <w:tcMar>
+              <w:top w:w="100.0" w:type="dxa"/>
+              <w:left w:w="100.0" w:type="dxa"/>
+              <w:bottom w:w="100.0" w:type="dxa"/>
+              <w:right w:w="100.0" w:type="dxa"/>
+            </w:tcMar>
+            <w:vAlign w:val="top"/>
+          </w:tcPr>
+          <w:p>
+            <w:pPr>
+              <w:rPr/>
+            </w:pPr>
+            <w:r>
+              <w:rPr>
+                <w:rtl w:val="0"/>
+              </w:rPr>
+              <w:t xml:space="preserve">Manual</w:t>
+            </w:r>
+          </w:p>
+        </w:tc>
+        <w:tc>
+          <w:tcPr>
+            <w:tcBorders>
+              <w:top w:color="000000" w:space="0" w:sz="0" w:val="nil"/>
+              <w:left w:color="000000" w:space="0" w:sz="0" w:val="nil"/>
+              <w:bottom w:color="000000" w:space="0" w:sz="0" w:val="nil"/>
+              <w:right w:color="000000" w:space="0" w:sz="0" w:val="nil"/>
+            </w:tcBorders>
+            <w:tcMar>
+              <w:top w:w="100.0" w:type="dxa"/>
+              <w:left w:w="100.0" w:type="dxa"/>
+              <w:bottom w:w="100.0" w:type="dxa"/>
+              <w:right w:w="100.0" w:type="dxa"/>
+            </w:tcMar>
+            <w:vAlign w:val="top"/>
+          </w:tcPr>
+          <w:p>
+            <w:pPr>
+              <w:rPr/>
+            </w:pPr>
+            <w:r>
+              <w:rPr>
+                <w:rtl w:val="0"/>
+              </w:rPr>
+              <w:t xml:space="preserve">Raymel Guerrero</w:t>
+            </w:r>
+          </w:p>
+        </w:tc>
+      </w:tr>
+      <w:tr>
+        <w:trPr>
+          <w:cantSplit w:val="0"/>
+          <w:trHeight w:val="500" w:hRule="atLeast"/>
+          <w:tblHeader w:val="0"/>
+        </w:trPr>
+        <w:tc>
+          <w:tcPr>
+            <w:tcBorders>
+              <w:top w:color="000000" w:space="0" w:sz="0" w:val="nil"/>
+              <w:left w:color="000000" w:space="0" w:sz="0" w:val="nil"/>
+              <w:bottom w:color="000000" w:space="0" w:sz="0" w:val="nil"/>
+              <w:right w:color="000000" w:space="0" w:sz="0" w:val="nil"/>
+            </w:tcBorders>
+            <w:tcMar>
+              <w:top w:w="100.0" w:type="dxa"/>
+              <w:left w:w="100.0" w:type="dxa"/>
+              <w:bottom w:w="100.0" w:type="dxa"/>
+              <w:right w:w="100.0" w:type="dxa"/>
+            </w:tcMar>
+            <w:vAlign w:val="top"/>
+          </w:tcPr>
+          <w:p>
+            <w:pPr>
+              <w:rPr/>
+            </w:pPr>
+            <w:r>
+              <w:rPr>
+                <w:rtl w:val="0"/>
+              </w:rPr>
+              <w:t xml:space="preserve">Automatización de pruebas básicas</w:t>
+            </w:r>
+          </w:p>
+        </w:tc>
+        <w:tc>
+          <w:tcPr>
+            <w:tcBorders>
+              <w:top w:color="000000" w:space="0" w:sz="0" w:val="nil"/>
+              <w:left w:color="000000" w:space="0" w:sz="0" w:val="nil"/>
+              <w:bottom w:color="000000" w:space="0" w:sz="0" w:val="nil"/>
+              <w:right w:color="000000" w:space="0" w:sz="0" w:val="nil"/>
+            </w:tcBorders>
+            <w:tcMar>
+              <w:top w:w="100.0" w:type="dxa"/>
+              <w:left w:w="100.0" w:type="dxa"/>
+              <w:bottom w:w="100.0" w:type="dxa"/>
+              <w:right w:w="100.0" w:type="dxa"/>
+            </w:tcMar>
+            <w:vAlign w:val="top"/>
+          </w:tcPr>
+          <w:p>
+            <w:pPr>
+              <w:rPr/>
+            </w:pPr>
+            <w:r>
+              <w:rPr>
+                <w:rtl w:val="0"/>
+              </w:rPr>
+              <w:t xml:space="preserve">15/04/2026</w:t>
+            </w:r>
+          </w:p>
+        </w:tc>
+        <w:tc>
+          <w:tcPr>
+            <w:tcBorders>
+              <w:top w:color="000000" w:space="0" w:sz="0" w:val="nil"/>
+              <w:left w:color="000000" w:space="0" w:sz="0" w:val="nil"/>
+              <w:bottom w:color="000000" w:space="0" w:sz="0" w:val="nil"/>
+              <w:right w:color="000000" w:space="0" w:sz="0" w:val="nil"/>
+            </w:tcBorders>
+            <w:tcMar>
+              <w:top w:w="100.0" w:type="dxa"/>
+              <w:left w:w="100.0" w:type="dxa"/>
+              <w:bottom w:w="100.0" w:type="dxa"/>
+              <w:right w:w="100.0" w:type="dxa"/>
+            </w:tcMar>
+            <w:vAlign w:val="top"/>
+          </w:tcPr>
+          <w:p>
+            <w:pPr>
+              <w:rPr/>
+            </w:pPr>
+            <w:r>
+              <w:rPr>
+                <w:rtl w:val="0"/>
+              </w:rPr>
+              <w:t xml:space="preserve">Automatizada</w:t>
+            </w:r>
+          </w:p>
+        </w:tc>
+        <w:tc>
+          <w:tcPr>
+            <w:tcBorders>
+              <w:top w:color="000000" w:space="0" w:sz="0" w:val="nil"/>
+              <w:left w:color="000000" w:space="0" w:sz="0" w:val="nil"/>
+              <w:bottom w:color="000000" w:space="0" w:sz="0" w:val="nil"/>
+              <w:right w:color="000000" w:space="0" w:sz="0" w:val="nil"/>
+            </w:tcBorders>
+            <w:tcMar>
+              <w:top w:w="100.0" w:type="dxa"/>
+              <w:left w:w="100.0" w:type="dxa"/>
+              <w:bottom w:w="100.0" w:type="dxa"/>
+              <w:right w:w="100.0" w:type="dxa"/>
+            </w:tcMar>
+            <w:vAlign w:val="top"/>
+          </w:tcPr>
+          <w:p>
+            <w:pPr>
+              <w:rPr/>
+            </w:pPr>
+            <w:r>
+              <w:rPr>
+                <w:rtl w:val="0"/>
+              </w:rPr>
+              <w:t xml:space="preserve">Raymel Guerrero</w:t>
+            </w:r>
+          </w:p>
+        </w:tc>
+      </w:tr>
+      <w:tr>
+        <w:trPr>
+          <w:cantSplit w:val="0"/>
+          <w:trHeight w:val="500" w:hRule="atLeast"/>
+          <w:tblHeader w:val="0"/>
+        </w:trPr>
+        <w:tc>
+          <w:tcPr>
+            <w:tcBorders>
+              <w:top w:color="000000" w:space="0" w:sz="0" w:val="nil"/>
+              <w:left w:color="000000" w:space="0" w:sz="0" w:val="nil"/>
+              <w:bottom w:color="000000" w:space="0" w:sz="0" w:val="nil"/>
+              <w:right w:color="000000" w:space="0" w:sz="0" w:val="nil"/>
+            </w:tcBorders>
+            <w:tcMar>
+              <w:top w:w="100.0" w:type="dxa"/>
+              <w:left w:w="100.0" w:type="dxa"/>
+              <w:bottom w:w="100.0" w:type="dxa"/>
+              <w:right w:w="100.0" w:type="dxa"/>
+            </w:tcMar>
+            <w:vAlign w:val="top"/>
+          </w:tcPr>
+          <w:p>
+            <w:pPr>
+              <w:rPr/>
+            </w:pPr>
+            <w:r>
+              <w:rPr>
+                <w:rtl w:val="0"/>
+              </w:rPr>
+              <w:t xml:space="preserve">Recolección de evidencias</w:t>
+            </w:r>
+          </w:p>
+        </w:tc>
+        <w:tc>
+          <w:tcPr>
+            <w:tcBorders>
+              <w:top w:color="000000" w:space="0" w:sz="0" w:val="nil"/>
+              <w:left w:color="000000" w:space="0" w:sz="0" w:val="nil"/>
+              <w:bottom w:color="000000" w:space="0" w:sz="0" w:val="nil"/>
+              <w:right w:color="000000" w:space="0" w:sz="0" w:val="nil"/>
+            </w:tcBorders>
+            <w:tcMar>
+              <w:top w:w="100.0" w:type="dxa"/>
+              <w:left w:w="100.0" w:type="dxa"/>
+              <w:bottom w:w="100.0" w:type="dxa"/>
+              <w:right w:w="100.0" w:type="dxa"/>
+            </w:tcMar>
+            <w:vAlign w:val="top"/>
+          </w:tcPr>
+          <w:p>
+            <w:pPr>
+              <w:rPr/>
+            </w:pPr>
+            <w:r>
+              <w:rPr>
+                <w:rtl w:val="0"/>
+              </w:rPr>
+              <w:t xml:space="preserve">15/04/2026</w:t>
+            </w:r>
+          </w:p>
+        </w:tc>
+        <w:tc>
+          <w:tcPr>
+            <w:tcBorders>
+              <w:top w:color="000000" w:space="0" w:sz="0" w:val="nil"/>
+              <w:left w:color="000000" w:space="0" w:sz="0" w:val="nil"/>
+              <w:bottom w:color="000000" w:space="0" w:sz="0" w:val="nil"/>
+              <w:right w:color="000000" w:space="0" w:sz="0" w:val="nil"/>
+            </w:tcBorders>
+            <w:tcMar>
+              <w:top w:w="100.0" w:type="dxa"/>
+              <w:left w:w="100.0" w:type="dxa"/>
+              <w:bottom w:w="100.0" w:type="dxa"/>
+              <w:right w:w="100.0" w:type="dxa"/>
+            </w:tcMar>
+            <w:vAlign w:val="top"/>
+          </w:tcPr>
+          <w:p>
+            <w:pPr>
+              <w:rPr/>
+            </w:pPr>
+            <w:r>
+              <w:rPr>
+                <w:rtl w:val="0"/>
+              </w:rPr>
+              <w:t xml:space="preserve">Evidencia</w:t>
+            </w:r>
+          </w:p>
+        </w:tc>
+        <w:tc>
+          <w:tcPr>
+            <w:tcBorders>
+              <w:top w:color="000000" w:space="0" w:sz="0" w:val="nil"/>
+              <w:left w:color="000000" w:space="0" w:sz="0" w:val="nil"/>
+              <w:bottom w:color="000000" w:space="0" w:sz="0" w:val="nil"/>
+              <w:right w:color="000000" w:space="0" w:sz="0" w:val="nil"/>
+            </w:tcBorders>
+            <w:tcMar>
+              <w:top w:w="100.0" w:type="dxa"/>
+              <w:left w:w="100.0" w:type="dxa"/>
+              <w:bottom w:w="100.0" w:type="dxa"/>
+              <w:right w:w="100.0" w:type="dxa"/>
+            </w:tcMar>
+            <w:vAlign w:val="top"/>
+          </w:tcPr>
+          <w:p>
+            <w:pPr>
+              <w:rPr/>
+            </w:pPr>
+            <w:r>
+              <w:rPr>
+                <w:rtl w:val="0"/>
+              </w:rPr>
+              <w:t xml:space="preserve">Raymel Guerrero</w:t>
+            </w:r>
+          </w:p>
+        </w:tc>
+      </w:tr>
+      <w:tr>
+        <w:trPr>
+          <w:cantSplit w:val="0"/>
+          <w:trHeight w:val="500" w:hRule="atLeast"/>
+          <w:tblHeader w:val="0"/>
+        </w:trPr>
+        <w:tc>
+          <w:tcPr>
+            <w:tcBorders>
+              <w:top w:color="000000" w:space="0" w:sz="0" w:val="nil"/>
+              <w:left w:color="000000" w:space="0" w:sz="0" w:val="nil"/>
+              <w:bottom w:color="000000" w:space="0" w:sz="0" w:val="nil"/>
+              <w:right w:color="000000" w:space="0" w:sz="0" w:val="nil"/>
+            </w:tcBorders>
+            <w:tcMar>
+              <w:top w:w="100.0" w:type="dxa"/>
+              <w:left w:w="100.0" w:type="dxa"/>
+              <w:bottom w:w="100.0" w:type="dxa"/>
+              <w:right w:w="100.0" w:type="dxa"/>
+            </w:tcMar>
+            <w:vAlign w:val="top"/>
+          </w:tcPr>
+          <w:p>
+            <w:pPr>
+              <w:rPr/>
+            </w:pPr>
+            <w:r>
+              <w:rPr>
+                <w:rtl w:val="0"/>
+              </w:rPr>
+              <w:t xml:space="preserve">Revisión final de pruebas</w:t>
+            </w:r>
+          </w:p>
+        </w:tc>
+        <w:tc>
+          <w:tcPr>
+            <w:tcBorders>
+              <w:top w:color="000000" w:space="0" w:sz="0" w:val="nil"/>
+              <w:left w:color="000000" w:space="0" w:sz="0" w:val="nil"/>
+              <w:bottom w:color="000000" w:space="0" w:sz="0" w:val="nil"/>
+              <w:right w:color="000000" w:space="0" w:sz="0" w:val="nil"/>
+            </w:tcBorders>
+            <w:tcMar>
+              <w:top w:w="100.0" w:type="dxa"/>
+              <w:left w:w="100.0" w:type="dxa"/>
+              <w:bottom w:w="100.0" w:type="dxa"/>
+              <w:right w:w="100.0" w:type="dxa"/>
+            </w:tcMar>
+            <w:vAlign w:val="top"/>
+          </w:tcPr>
+          <w:p>
+            <w:pPr>
+              <w:rPr/>
+            </w:pPr>
+            <w:r>
+              <w:rPr>
+                <w:rtl w:val="0"/>
+              </w:rPr>
+              <w:t xml:space="preserve">16/04/2026</w:t>
+            </w:r>
+          </w:p>
+        </w:tc>
+        <w:tc>
+          <w:tcPr>
+            <w:tcBorders>
+              <w:top w:color="000000" w:space="0" w:sz="0" w:val="nil"/>
+              <w:left w:color="000000" w:space="0" w:sz="0" w:val="nil"/>
+              <w:bottom w:color="000000" w:space="0" w:sz="0" w:val="nil"/>
+              <w:right w:color="000000" w:space="0" w:sz="0" w:val="nil"/>
+            </w:tcBorders>
+            <w:tcMar>
+              <w:top w:w="100.0" w:type="dxa"/>
+              <w:left w:w="100.0" w:type="dxa"/>
+              <w:bottom w:w="100.0" w:type="dxa"/>
+              <w:right w:w="100.0" w:type="dxa"/>
+            </w:tcMar>
+            <w:vAlign w:val="top"/>
+          </w:tcPr>
+          <w:p>
+            <w:pPr>
+              <w:rPr/>
+            </w:pPr>
+            <w:r>
+              <w:rPr>
+                <w:rtl w:val="0"/>
+              </w:rPr>
+              <w:t xml:space="preserve">Cierre</w:t>
+            </w:r>
+          </w:p>
+        </w:tc>
+        <w:tc>
+          <w:tcPr>
+            <w:tcBorders>
+              <w:top w:color="000000" w:space="0" w:sz="0" w:val="nil"/>
+              <w:left w:color="000000" w:space="0" w:sz="0" w:val="nil"/>
+              <w:bottom w:color="000000" w:space="0" w:sz="0" w:val="nil"/>
+              <w:right w:color="000000" w:space="0" w:sz="0" w:val="nil"/>
+            </w:tcBorders>
+            <w:tcMar>
+              <w:top w:w="100.0" w:type="dxa"/>
+              <w:left w:w="100.0" w:type="dxa"/>
+              <w:bottom w:w="100.0" w:type="dxa"/>
+              <w:right w:w="100.0" w:type="dxa"/>
+            </w:tcMar>
+            <w:vAlign w:val="top"/>
+          </w:tcPr>
+          <w:p>
+            <w:pPr>
+              <w:rPr/>
+            </w:pPr>
+            <w:r>
+              <w:rPr>
+                <w:rtl w:val="0"/>
+              </w:rPr>
+              <w:t xml:space="preserve">Raymel Guerrero</w:t>
+            </w:r>
+          </w:p>
+        </w:tc>
+      </w:tr>
+    </w:tbl>
+    <w:p>
+      <w:pPr>
+        <w:rPr/>
+      </w:pPr>
+      <w:r>
+        <w:rPr>
+          <w:rtl w:val="0"/>
+        </w:rPr>
+      </w:r>
+    </w:p>
+    <w:p>
+      <w:pPr>
+        <w:rPr/>
+      </w:pPr>
+      <w:r>
+        <w:rPr>
+          <w:rtl w:val="0"/>
+        </w:rPr>
+        <w:t xml:space="preserve">4.5 Plantilla para casos de prueba</w:t>
+      </w:r>
+    </w:p>
+    <w:p>
+      <w:pPr>
+        <w:rPr/>
+      </w:pPr>
+      <w:r>
+        <w:rPr>
+          <w:rtl w:val="0"/>
+        </w:rPr>
+        <w:t xml:space="preserve">La siguiente plantilla será utilizada para documentar los casos de prueba ejecutados en el sistema.</w:t>
+      </w:r>
+    </w:p>
+    <w:p>
+      <w:pPr>
+        <w:rPr/>
+      </w:pPr>
+      <w:r>
+        <w:rPr>
+          <w:rtl w:val="0"/>
+        </w:rPr>
+      </w:r>
+    </w:p>
+    <w:p>
+      <w:pPr>
+        <w:rPr/>
+      </w:pPr>
+      <w:r>
+        <w:rPr>
+          <w:rtl w:val="0"/>
+        </w:rPr>
+      </w:r>
+    </w:p>
+    <w:tbl>
+      <w:tblPr>
+        <w:tblStyle w:val="Table4"/>
+        <w:tblW w:w="9025.511811023624" w:type="dxa"/>
+        <w:jc w:val="left"/>
+        <w:tblBorders>
+          <w:top w:color="000000" w:space="0" w:sz="0" w:val="nil"/>
+          <w:left w:color="000000" w:space="0" w:sz="0" w:val="nil"/>
+          <w:bottom w:color="000000" w:space="0" w:sz="0" w:val="nil"/>
+          <w:right w:color="000000" w:space="0" w:sz="0" w:val="nil"/>
+          <w:insideH w:color="000000" w:space="0" w:sz="0" w:val="nil"/>
+          <w:insideV w:color="000000" w:space="0" w:sz="0" w:val="nil"/>
+        </w:tblBorders>
+        <w:tblLayout w:type="fixed"/>
+        <w:tblLook w:val="0600"/>
+      </w:tblPr>
+      <w:tblGrid>
+        <w:gridCol w:w="432.25631278848766"/>
+        <w:gridCol w:w="886.1254412163997"/>
+        <w:gridCol w:w="1054.70540320391"/>
+        <w:gridCol w:w="1352.9622590279664"/>
+        <w:gridCol w:w="691.6101004615803"/>
+        <w:gridCol w:w="1132.5115395058376"/>
+        <w:gridCol w:w="1339.9945696443117"/>
+        <w:gridCol w:w="1327.0268802606572"/>
+        <w:gridCol w:w="808.319304914472"/>
+        <w:tblGridChange w:id="0">
+          <w:tblGrid>
+            <w:gridCol w:w="432.25631278848766"/>
+            <w:gridCol w:w="886.1254412163997"/>
+            <w:gridCol w:w="1054.70540320391"/>
+            <w:gridCol w:w="1352.9622590279664"/>
+            <w:gridCol w:w="691.6101004615803"/>
+            <w:gridCol w:w="1132.5115395058376"/>
+            <w:gridCol w:w="1339.9945696443117"/>
+            <w:gridCol w:w="1327.0268802606572"/>
+            <w:gridCol w:w="808.319304914472"/>
+          </w:tblGrid>
+        </w:tblGridChange>
+      </w:tblGrid>
+      <w:tr>
+        <w:trPr>
+          <w:cantSplit w:val="0"/>
+          <w:trHeight w:val="785" w:hRule="atLeast"/>
+          <w:tblHeader w:val="0"/>
+        </w:trPr>
+        <w:tc>
+          <w:tcPr>
+            <w:tcBorders>
+              <w:top w:color="000000" w:space="0" w:sz="0" w:val="nil"/>
+              <w:left w:color="000000" w:space="0" w:sz="0" w:val="nil"/>
+              <w:bottom w:color="000000" w:space="0" w:sz="0" w:val="nil"/>
+              <w:right w:color="000000" w:space="0" w:sz="0" w:val="nil"/>
+            </w:tcBorders>
+            <w:tcMar>
+              <w:top w:w="100.0" w:type="dxa"/>
+              <w:left w:w="100.0" w:type="dxa"/>
+              <w:bottom w:w="100.0" w:type="dxa"/>
+              <w:right w:w="100.0" w:type="dxa"/>
+            </w:tcMar>
+            <w:vAlign w:val="top"/>
+          </w:tcPr>
+          <w:p>
+            <w:pPr>
+              <w:jc w:val="center"/>
+              <w:rPr/>
+            </w:pPr>
+            <w:r>
+              <w:rPr>
+                <w:b w:val="1"/>
+                <w:bCs w:val="1"/>
+                <w:rtl w:val="0"/>
+              </w:rPr>
+              <w:t xml:space="preserve">ID</w:t>
+            </w:r>
+            <w:r>
+              <w:rPr>
+                <w:rtl w:val="0"/>
+              </w:rPr>
+            </w:r>
+          </w:p>
+        </w:tc>
+        <w:tc>
+          <w:tcPr>
+            <w:tcBorders>
+              <w:top w:color="000000" w:space="0" w:sz="0" w:val="nil"/>
+              <w:left w:color="000000" w:space="0" w:sz="0" w:val="nil"/>
+              <w:bottom w:color="000000" w:space="0" w:sz="0" w:val="nil"/>
+              <w:right w:color="000000" w:space="0" w:sz="0" w:val="nil"/>
+            </w:tcBorders>
+            <w:tcMar>
+              <w:top w:w="100.0" w:type="dxa"/>
+              <w:left w:w="100.0" w:type="dxa"/>
+              <w:bottom w:w="100.0" w:type="dxa"/>
+              <w:right w:w="100.0" w:type="dxa"/>
+            </w:tcMar>
+            <w:vAlign w:val="top"/>
+          </w:tcPr>
+          <w:p>
+            <w:pPr>
+              <w:jc w:val="center"/>
+              <w:rPr/>
+            </w:pPr>
+            <w:r>
+              <w:rPr>
+                <w:b w:val="1"/>
+                <w:bCs w:val="1"/>
+                <w:rtl w:val="0"/>
+              </w:rPr>
+              <w:t xml:space="preserve">Módulo</w:t>
+            </w:r>
+            <w:r>
+              <w:rPr>
+                <w:rtl w:val="0"/>
+              </w:rPr>
+            </w:r>
+          </w:p>
+        </w:tc>
+        <w:tc>
+          <w:tcPr>
+            <w:tcBorders>
+              <w:top w:color="000000" w:space="0" w:sz="0" w:val="nil"/>
+              <w:left w:color="000000" w:space="0" w:sz="0" w:val="nil"/>
+              <w:bottom w:color="000000" w:space="0" w:sz="0" w:val="nil"/>
+              <w:right w:color="000000" w:space="0" w:sz="0" w:val="nil"/>
+            </w:tcBorders>
+            <w:tcMar>
+              <w:top w:w="100.0" w:type="dxa"/>
+              <w:left w:w="100.0" w:type="dxa"/>
+              <w:bottom w:w="100.0" w:type="dxa"/>
+              <w:right w:w="100.0" w:type="dxa"/>
+            </w:tcMar>
+            <w:vAlign w:val="top"/>
+          </w:tcPr>
+          <w:p>
+            <w:pPr>
+              <w:jc w:val="center"/>
+              <w:rPr/>
+            </w:pPr>
+            <w:r>
+              <w:rPr>
+                <w:b w:val="1"/>
+                <w:bCs w:val="1"/>
+                <w:rtl w:val="0"/>
+              </w:rPr>
+              <w:t xml:space="preserve">Caso de prueba</w:t>
+            </w:r>
+            <w:r>
+              <w:rPr>
+                <w:rtl w:val="0"/>
+              </w:rPr>
+            </w:r>
+          </w:p>
+        </w:tc>
+        <w:tc>
+          <w:tcPr>
+            <w:tcBorders>
+              <w:top w:color="000000" w:space="0" w:sz="0" w:val="nil"/>
+              <w:left w:color="000000" w:space="0" w:sz="0" w:val="nil"/>
+              <w:bottom w:color="000000" w:space="0" w:sz="0" w:val="nil"/>
+              <w:right w:color="000000" w:space="0" w:sz="0" w:val="nil"/>
+            </w:tcBorders>
+            <w:tcMar>
+              <w:top w:w="100.0" w:type="dxa"/>
+              <w:left w:w="100.0" w:type="dxa"/>
+              <w:bottom w:w="100.0" w:type="dxa"/>
+              <w:right w:w="100.0" w:type="dxa"/>
+            </w:tcMar>
+            <w:vAlign w:val="top"/>
+          </w:tcPr>
+          <w:p>
+            <w:pPr>
+              <w:jc w:val="center"/>
+              <w:rPr/>
+            </w:pPr>
+            <w:r>
+              <w:rPr>
+                <w:b w:val="1"/>
+                <w:bCs w:val="1"/>
+                <w:rtl w:val="0"/>
+              </w:rPr>
+              <w:t xml:space="preserve">Precondición</w:t>
+            </w:r>
+            <w:r>
+              <w:rPr>
+                <w:rtl w:val="0"/>
+              </w:rPr>
+            </w:r>
+          </w:p>
+        </w:tc>
+        <w:tc>
+          <w:tcPr>
+            <w:tcBorders>
+              <w:top w:color="000000" w:space="0" w:sz="0" w:val="nil"/>
+              <w:left w:color="000000" w:space="0" w:sz="0" w:val="nil"/>
+              <w:bottom w:color="000000" w:space="0" w:sz="0" w:val="nil"/>
+              <w:right w:color="000000" w:space="0" w:sz="0" w:val="nil"/>
+            </w:tcBorders>
+            <w:tcMar>
+              <w:top w:w="100.0" w:type="dxa"/>
+              <w:left w:w="100.0" w:type="dxa"/>
+              <w:bottom w:w="100.0" w:type="dxa"/>
+              <w:right w:w="100.0" w:type="dxa"/>
+            </w:tcMar>
+            <w:vAlign w:val="top"/>
+          </w:tcPr>
+          <w:p>
+            <w:pPr>
+              <w:jc w:val="center"/>
+              <w:rPr/>
+            </w:pPr>
+            <w:r>
+              <w:rPr>
+                <w:b w:val="1"/>
+                <w:bCs w:val="1"/>
+                <w:rtl w:val="0"/>
+              </w:rPr>
+              <w:t xml:space="preserve">Pasos</w:t>
+            </w:r>
+            <w:r>
+              <w:rPr>
+                <w:rtl w:val="0"/>
+              </w:rPr>
+            </w:r>
+          </w:p>
+        </w:tc>
+        <w:tc>
+          <w:tcPr>
+            <w:tcBorders>
+              <w:top w:color="000000" w:space="0" w:sz="0" w:val="nil"/>
+              <w:left w:color="000000" w:space="0" w:sz="0" w:val="nil"/>
+              <w:bottom w:color="000000" w:space="0" w:sz="0" w:val="nil"/>
+              <w:right w:color="000000" w:space="0" w:sz="0" w:val="nil"/>
+            </w:tcBorders>
+            <w:tcMar>
+              <w:top w:w="100.0" w:type="dxa"/>
+              <w:left w:w="100.0" w:type="dxa"/>
+              <w:bottom w:w="100.0" w:type="dxa"/>
+              <w:right w:w="100.0" w:type="dxa"/>
+            </w:tcMar>
+            <w:vAlign w:val="top"/>
+          </w:tcPr>
+          <w:p>
+            <w:pPr>
+              <w:jc w:val="center"/>
+              <w:rPr/>
+            </w:pPr>
+            <w:r>
+              <w:rPr>
+                <w:b w:val="1"/>
+                <w:bCs w:val="1"/>
+                <w:rtl w:val="0"/>
+              </w:rPr>
+              <w:t xml:space="preserve">Datos de entrada</w:t>
+            </w:r>
+            <w:r>
+              <w:rPr>
+                <w:rtl w:val="0"/>
+              </w:rPr>
+            </w:r>
+          </w:p>
+        </w:tc>
+        <w:tc>
+          <w:tcPr>
+            <w:tcBorders>
+              <w:top w:color="000000" w:space="0" w:sz="0" w:val="nil"/>
+              <w:left w:color="000000" w:space="0" w:sz="0" w:val="nil"/>
+              <w:bottom w:color="000000" w:space="0" w:sz="0" w:val="nil"/>
+              <w:right w:color="000000" w:space="0" w:sz="0" w:val="nil"/>
+            </w:tcBorders>
+            <w:tcMar>
+              <w:top w:w="100.0" w:type="dxa"/>
+              <w:left w:w="100.0" w:type="dxa"/>
+              <w:bottom w:w="100.0" w:type="dxa"/>
+              <w:right w:w="100.0" w:type="dxa"/>
+            </w:tcMar>
+            <w:vAlign w:val="top"/>
+          </w:tcPr>
+          <w:p>
+            <w:pPr>
+              <w:jc w:val="center"/>
+              <w:rPr/>
+            </w:pPr>
+            <w:r>
+              <w:rPr>
+                <w:b w:val="1"/>
+                <w:bCs w:val="1"/>
+                <w:rtl w:val="0"/>
+              </w:rPr>
+              <w:t xml:space="preserve">Resultado esperado</w:t>
+            </w:r>
+            <w:r>
+              <w:rPr>
+                <w:rtl w:val="0"/>
+              </w:rPr>
+            </w:r>
+          </w:p>
+        </w:tc>
+        <w:tc>
+          <w:tcPr>
+            <w:tcBorders>
+              <w:top w:color="000000" w:space="0" w:sz="0" w:val="nil"/>
+              <w:left w:color="000000" w:space="0" w:sz="0" w:val="nil"/>
+              <w:bottom w:color="000000" w:space="0" w:sz="0" w:val="nil"/>
+              <w:right w:color="000000" w:space="0" w:sz="0" w:val="nil"/>
+            </w:tcBorders>
+            <w:tcMar>
+              <w:top w:w="100.0" w:type="dxa"/>
+              <w:left w:w="100.0" w:type="dxa"/>
+              <w:bottom w:w="100.0" w:type="dxa"/>
+              <w:right w:w="100.0" w:type="dxa"/>
+            </w:tcMar>
+            <w:vAlign w:val="top"/>
+          </w:tcPr>
+          <w:p>
+            <w:pPr>
+              <w:jc w:val="center"/>
+              <w:rPr/>
+            </w:pPr>
+            <w:r>
+              <w:rPr>
+                <w:b w:val="1"/>
+                <w:bCs w:val="1"/>
+                <w:rtl w:val="0"/>
+              </w:rPr>
+              <w:t xml:space="preserve">Resultado obtenido</w:t>
+            </w:r>
+            <w:r>
+              <w:rPr>
+                <w:rtl w:val="0"/>
+              </w:rPr>
+            </w:r>
+          </w:p>
+        </w:tc>
+        <w:tc>
+          <w:tcPr>
+            <w:tcBorders>
+              <w:top w:color="000000" w:space="0" w:sz="0" w:val="nil"/>
+              <w:left w:color="000000" w:space="0" w:sz="0" w:val="nil"/>
+              <w:bottom w:color="000000" w:space="0" w:sz="0" w:val="nil"/>
+              <w:right w:color="000000" w:space="0" w:sz="0" w:val="nil"/>
+            </w:tcBorders>
+            <w:tcMar>
+              <w:top w:w="100.0" w:type="dxa"/>
+              <w:left w:w="100.0" w:type="dxa"/>
+              <w:bottom w:w="100.0" w:type="dxa"/>
+              <w:right w:w="100.0" w:type="dxa"/>
+            </w:tcMar>
+            <w:vAlign w:val="top"/>
+          </w:tcPr>
+          <w:p>
+            <w:pPr>
+              <w:jc w:val="center"/>
+              <w:rPr/>
+            </w:pPr>
+            <w:r>
+              <w:rPr>
+                <w:b w:val="1"/>
+                <w:bCs w:val="1"/>
+                <w:rtl w:val="0"/>
+              </w:rPr>
+              <w:t xml:space="preserve">Estado</w:t>
+            </w:r>
+            <w:r>
+              <w:rPr>
+                <w:rtl w:val="0"/>
+              </w:rPr>
+            </w:r>
+          </w:p>
+        </w:tc>
+      </w:tr>
+    </w:tbl>
+    <w:p>
+      <w:pPr>
+        <w:rPr/>
+      </w:pPr>
+      <w:r>
+        <w:rPr>
+          <w:rtl w:val="0"/>
+        </w:rPr>
+      </w:r>
+    </w:p>
+    <w:tbl>
+      <w:tblPr>
+        <w:tblStyle w:val="Table5"/>
+        <w:tblW w:w="9025.511811023622" w:type="dxa"/>
+        <w:jc w:val="left"/>
+        <w:tblBorders>
+          <w:top w:color="000000" w:space="0" w:sz="0" w:val="nil"/>
+          <w:left w:color="000000" w:space="0" w:sz="0" w:val="nil"/>
+          <w:bottom w:color="000000" w:space="0" w:sz="0" w:val="nil"/>
+          <w:right w:color="000000" w:space="0" w:sz="0" w:val="nil"/>
+          <w:insideH w:color="000000" w:space="0" w:sz="0" w:val="nil"/>
+          <w:insideV w:color="000000" w:space="0" w:sz="0" w:val="nil"/>
+        </w:tblBorders>
+        <w:tblLayout w:type="fixed"/>
+        <w:tblLook w:val="0600"/>
+      </w:tblPr>
+      <w:tblGrid>
+        <w:gridCol w:w="507.7112641254571"/>
+        <w:gridCol w:w="1250.3963364412086"/>
+        <w:gridCol w:w="1036.402332553619"/>
+        <w:gridCol w:w="960.8750370638818"/>
+        <w:gridCol w:w="1300.7478667677"/>
+        <w:gridCol w:w="1124.5175106249794"/>
+        <w:gridCol w:w="1036.402332553619"/>
+        <w:gridCol w:w="809.8204460844069"/>
+        <w:gridCol w:w="998.6386848087504"/>
+        <w:tblGridChange w:id="0">
+          <w:tblGrid>
+            <w:gridCol w:w="507.7112641254571"/>
+            <w:gridCol w:w="1250.3963364412086"/>
+            <w:gridCol w:w="1036.402332553619"/>
+            <w:gridCol w:w="960.8750370638818"/>
+            <w:gridCol w:w="1300.7478667677"/>
+            <w:gridCol w:w="1124.5175106249794"/>
+            <w:gridCol w:w="1036.402332553619"/>
+            <w:gridCol w:w="809.8204460844069"/>
+            <w:gridCol w:w="998.6386848087504"/>
+          </w:tblGrid>
+        </w:tblGridChange>
+      </w:tblGrid>
+      <w:tr>
+        <w:trPr>
+          <w:cantSplit w:val="0"/>
+          <w:trHeight w:val="1880" w:hRule="atLeast"/>
+          <w:tblHeader w:val="0"/>
+        </w:trPr>
+        <w:tc>
+          <w:tcPr>
+            <w:tcBorders>
+              <w:top w:color="000000" w:space="0" w:sz="0" w:val="nil"/>
+              <w:left w:color="000000" w:space="0" w:sz="0" w:val="nil"/>
+              <w:bottom w:color="000000" w:space="0" w:sz="0" w:val="nil"/>
+              <w:right w:color="000000" w:space="0" w:sz="0" w:val="nil"/>
+            </w:tcBorders>
+            <w:tcMar>
+              <w:top w:w="100.0" w:type="dxa"/>
+              <w:left w:w="100.0" w:type="dxa"/>
+              <w:bottom w:w="100.0" w:type="dxa"/>
+              <w:right w:w="100.0" w:type="dxa"/>
+            </w:tcMar>
+            <w:vAlign w:val="top"/>
+          </w:tcPr>
+          <w:p>
+            <w:pPr>
+              <w:rPr/>
+            </w:pPr>
+            <w:r>
+              <w:rPr>
+                <w:rtl w:val="0"/>
+              </w:rPr>
+              <w:t xml:space="preserve">CP-01</w:t>
+            </w:r>
+          </w:p>
+        </w:tc>
+        <w:tc>
+          <w:tcPr>
+            <w:tcBorders>
+              <w:top w:color="000000" w:space="0" w:sz="0" w:val="nil"/>
+              <w:left w:color="000000" w:space="0" w:sz="0" w:val="nil"/>
+              <w:bottom w:color="000000" w:space="0" w:sz="0" w:val="nil"/>
+              <w:right w:color="000000" w:space="0" w:sz="0" w:val="nil"/>
+            </w:tcBorders>
+            <w:tcMar>
+              <w:top w:w="100.0" w:type="dxa"/>
+              <w:left w:w="100.0" w:type="dxa"/>
+              <w:bottom w:w="100.0" w:type="dxa"/>
+              <w:right w:w="100.0" w:type="dxa"/>
+            </w:tcMar>
+            <w:vAlign w:val="top"/>
+          </w:tcPr>
+          <w:p>
+            <w:pPr>
+              <w:rPr/>
+            </w:pPr>
+            <w:r>
+              <w:rPr>
+                <w:rtl w:val="0"/>
+              </w:rPr>
+              <w:t xml:space="preserve">Habitaciones</w:t>
+            </w:r>
+          </w:p>
+        </w:tc>
+        <w:tc>
+          <w:tcPr>
+            <w:tcBorders>
+              <w:top w:color="000000" w:space="0" w:sz="0" w:val="nil"/>
+              <w:left w:color="000000" w:space="0" w:sz="0" w:val="nil"/>
+              <w:bottom w:color="000000" w:space="0" w:sz="0" w:val="nil"/>
+              <w:right w:color="000000" w:space="0" w:sz="0" w:val="nil"/>
+            </w:tcBorders>
+            <w:tcMar>
+              <w:top w:w="100.0" w:type="dxa"/>
+              <w:left w:w="100.0" w:type="dxa"/>
+              <w:bottom w:w="100.0" w:type="dxa"/>
+              <w:right w:w="100.0" w:type="dxa"/>
+            </w:tcMar>
+            <w:vAlign w:val="top"/>
+          </w:tcPr>
+          <w:p>
+            <w:pPr>
+              <w:rPr/>
+            </w:pPr>
+            <w:r>
+              <w:rPr>
+                <w:rtl w:val="0"/>
+              </w:rPr>
+              <w:t xml:space="preserve">Registrar habitación válida</w:t>
+            </w:r>
+          </w:p>
+        </w:tc>
+        <w:tc>
+          <w:tcPr>
+            <w:tcBorders>
+              <w:top w:color="000000" w:space="0" w:sz="0" w:val="nil"/>
+              <w:left w:color="000000" w:space="0" w:sz="0" w:val="nil"/>
+              <w:bottom w:color="000000" w:space="0" w:sz="0" w:val="nil"/>
+              <w:right w:color="000000" w:space="0" w:sz="0" w:val="nil"/>
+            </w:tcBorders>
+            <w:tcMar>
+              <w:top w:w="100.0" w:type="dxa"/>
+              <w:left w:w="100.0" w:type="dxa"/>
+              <w:bottom w:w="100.0" w:type="dxa"/>
+              <w:right w:w="100.0" w:type="dxa"/>
+            </w:tcMar>
+            <w:vAlign w:val="top"/>
+          </w:tcPr>
+          <w:p>
+            <w:pPr>
+              <w:rPr/>
+            </w:pPr>
+            <w:r>
+              <w:rPr>
+                <w:rtl w:val="0"/>
+              </w:rPr>
+              <w:t xml:space="preserve">Sistema en ejecución</w:t>
+            </w:r>
+          </w:p>
+        </w:tc>
+        <w:tc>
+          <w:tcPr>
+            <w:tcBorders>
+              <w:top w:color="000000" w:space="0" w:sz="0" w:val="nil"/>
+              <w:left w:color="000000" w:space="0" w:sz="0" w:val="nil"/>
+              <w:bottom w:color="000000" w:space="0" w:sz="0" w:val="nil"/>
+              <w:right w:color="000000" w:space="0" w:sz="0" w:val="nil"/>
+            </w:tcBorders>
+            <w:tcMar>
+              <w:top w:w="100.0" w:type="dxa"/>
+              <w:left w:w="100.0" w:type="dxa"/>
+              <w:bottom w:w="100.0" w:type="dxa"/>
+              <w:right w:w="100.0" w:type="dxa"/>
+            </w:tcMar>
+            <w:vAlign w:val="top"/>
+          </w:tcPr>
+          <w:p>
+            <w:pPr>
+              <w:rPr/>
+            </w:pPr>
+            <w:r>
+              <w:rPr>
+                <w:rtl w:val="0"/>
+              </w:rPr>
+              <w:t xml:space="preserve">Ir a Habitaciones, pulsar Crear, completar formulario, guardar</w:t>
+            </w:r>
+          </w:p>
+        </w:tc>
+        <w:tc>
+          <w:tcPr>
+            <w:tcBorders>
+              <w:top w:color="000000" w:space="0" w:sz="0" w:val="nil"/>
+              <w:left w:color="000000" w:space="0" w:sz="0" w:val="nil"/>
+              <w:bottom w:color="000000" w:space="0" w:sz="0" w:val="nil"/>
+              <w:right w:color="000000" w:space="0" w:sz="0" w:val="nil"/>
+            </w:tcBorders>
+            <w:tcMar>
+              <w:top w:w="100.0" w:type="dxa"/>
+              <w:left w:w="100.0" w:type="dxa"/>
+              <w:bottom w:w="100.0" w:type="dxa"/>
+              <w:right w:w="100.0" w:type="dxa"/>
+            </w:tcMar>
+            <w:vAlign w:val="top"/>
+          </w:tcPr>
+          <w:p>
+            <w:pPr>
+              <w:rPr/>
+            </w:pPr>
+            <w:r>
+              <w:rPr>
+                <w:rtl w:val="0"/>
+              </w:rPr>
+              <w:t xml:space="preserve">101, Simple, 2500, Disponible, 2</w:t>
+            </w:r>
+          </w:p>
+        </w:tc>
+        <w:tc>
+          <w:tcPr>
+            <w:tcBorders>
+              <w:top w:color="000000" w:space="0" w:sz="0" w:val="nil"/>
+              <w:left w:color="000000" w:space="0" w:sz="0" w:val="nil"/>
+              <w:bottom w:color="000000" w:space="0" w:sz="0" w:val="nil"/>
+              <w:right w:color="000000" w:space="0" w:sz="0" w:val="nil"/>
+            </w:tcBorders>
+            <w:tcMar>
+              <w:top w:w="100.0" w:type="dxa"/>
+              <w:left w:w="100.0" w:type="dxa"/>
+              <w:bottom w:w="100.0" w:type="dxa"/>
+              <w:right w:w="100.0" w:type="dxa"/>
+            </w:tcMar>
+            <w:vAlign w:val="top"/>
+          </w:tcPr>
+          <w:p>
+            <w:pPr>
+              <w:rPr/>
+            </w:pPr>
+            <w:r>
+              <w:rPr>
+                <w:rtl w:val="0"/>
+              </w:rPr>
+              <w:t xml:space="preserve">La habitación se guarda y aparece en el listado</w:t>
+            </w:r>
+          </w:p>
+        </w:tc>
+        <w:tc>
+          <w:tcPr>
+            <w:tcBorders>
+              <w:top w:color="000000" w:space="0" w:sz="0" w:val="nil"/>
+              <w:left w:color="000000" w:space="0" w:sz="0" w:val="nil"/>
+              <w:bottom w:color="000000" w:space="0" w:sz="0" w:val="nil"/>
+              <w:right w:color="000000" w:space="0" w:sz="0" w:val="nil"/>
+            </w:tcBorders>
+            <w:tcMar>
+              <w:top w:w="100.0" w:type="dxa"/>
+              <w:left w:w="100.0" w:type="dxa"/>
+              <w:bottom w:w="100.0" w:type="dxa"/>
+              <w:right w:w="100.0" w:type="dxa"/>
+            </w:tcMar>
+            <w:vAlign w:val="top"/>
+          </w:tcPr>
+          <w:p>
+            <w:pPr>
+              <w:rPr/>
+            </w:pPr>
+            <w:r>
+              <w:rPr>
+                <w:rtl w:val="0"/>
+              </w:rPr>
+              <w:t xml:space="preserve">Exitoso</w:t>
+            </w:r>
+          </w:p>
+        </w:tc>
+        <w:tc>
+          <w:tcPr>
+            <w:tcBorders>
+              <w:top w:color="000000" w:space="0" w:sz="0" w:val="nil"/>
+              <w:left w:color="000000" w:space="0" w:sz="0" w:val="nil"/>
+              <w:bottom w:color="000000" w:space="0" w:sz="0" w:val="nil"/>
+              <w:right w:color="000000" w:space="0" w:sz="0" w:val="nil"/>
+            </w:tcBorders>
+            <w:tcMar>
+              <w:top w:w="100.0" w:type="dxa"/>
+              <w:left w:w="100.0" w:type="dxa"/>
+              <w:bottom w:w="100.0" w:type="dxa"/>
+              <w:right w:w="100.0" w:type="dxa"/>
+            </w:tcMar>
+            <w:vAlign w:val="top"/>
+          </w:tcPr>
+          <w:p>
+            <w:pPr>
+              <w:rPr/>
+            </w:pPr>
+            <w:r>
+              <w:rPr>
+                <w:rtl w:val="0"/>
+              </w:rPr>
+              <w:t xml:space="preserve">Aprobado</w:t>
+            </w:r>
+          </w:p>
+        </w:tc>
+      </w:tr>
+    </w:tbl>
+    <w:p>
+      <w:pPr>
+        <w:rPr/>
+      </w:pPr>
+      <w:r>
+        <w:rPr>
+          <w:rtl w:val="0"/>
+        </w:rPr>
+      </w:r>
+    </w:p>
+    <w:tbl>
+      <w:tblPr>
+        <w:tblStyle w:val="Table6"/>
+        <w:tblW w:w="9025.511811023624" w:type="dxa"/>
+        <w:jc w:val="left"/>
+        <w:tblBorders>
+          <w:top w:color="000000" w:space="0" w:sz="0" w:val="nil"/>
+          <w:left w:color="000000" w:space="0" w:sz="0" w:val="nil"/>
+          <w:bottom w:color="000000" w:space="0" w:sz="0" w:val="nil"/>
+          <w:right w:color="000000" w:space="0" w:sz="0" w:val="nil"/>
+          <w:insideH w:color="000000" w:space="0" w:sz="0" w:val="nil"/>
+          <w:insideV w:color="000000" w:space="0" w:sz="0" w:val="nil"/>
+        </w:tblBorders>
+        <w:tblLayout w:type="fixed"/>
+        <w:tblLook w:val="0600"/>
+      </w:tblPr>
+      <w:tblGrid>
+        <w:gridCol w:w="522.2797365537342"/>
+        <w:gridCol w:w="871.9050147425978"/>
+        <w:gridCol w:w="975.4976897615202"/>
+        <w:gridCol w:w="1014.3449428936161"/>
+        <w:gridCol w:w="1208.5812085540958"/>
+        <w:gridCol w:w="1687.6973305166123"/>
+        <w:gridCol w:w="884.8540991199629"/>
+        <w:gridCol w:w="833.0577616105018"/>
+        <w:gridCol w:w="1027.2940272709816"/>
+        <w:tblGridChange w:id="0">
+          <w:tblGrid>
+            <w:gridCol w:w="522.2797365537342"/>
+            <w:gridCol w:w="871.9050147425978"/>
+            <w:gridCol w:w="975.4976897615202"/>
+            <w:gridCol w:w="1014.3449428936161"/>
+            <w:gridCol w:w="1208.5812085540958"/>
+            <w:gridCol w:w="1687.6973305166123"/>
+            <w:gridCol w:w="884.8540991199629"/>
+            <w:gridCol w:w="833.0577616105018"/>
+            <w:gridCol w:w="1027.2940272709816"/>
+          </w:tblGrid>
+        </w:tblGridChange>
+      </w:tblGrid>
+      <w:tr>
+        <w:trPr>
+          <w:cantSplit w:val="0"/>
+          <w:trHeight w:val="2435" w:hRule="atLeast"/>
+          <w:tblHeader w:val="0"/>
+        </w:trPr>
+        <w:tc>
+          <w:tcPr>
+            <w:tcBorders>
+              <w:top w:color="000000" w:space="0" w:sz="0" w:val="nil"/>
+              <w:left w:color="000000" w:space="0" w:sz="0" w:val="nil"/>
+              <w:bottom w:color="000000" w:space="0" w:sz="0" w:val="nil"/>
+              <w:right w:color="000000" w:space="0" w:sz="0" w:val="nil"/>
+            </w:tcBorders>
+            <w:tcMar>
+              <w:top w:w="100.0" w:type="dxa"/>
+              <w:left w:w="100.0" w:type="dxa"/>
+              <w:bottom w:w="100.0" w:type="dxa"/>
+              <w:right w:w="100.0" w:type="dxa"/>
+            </w:tcMar>
+            <w:vAlign w:val="top"/>
+          </w:tcPr>
+          <w:p>
+            <w:pPr>
+              <w:rPr/>
+            </w:pPr>
+            <w:r>
+              <w:rPr>
+                <w:rtl w:val="0"/>
+              </w:rPr>
+              <w:t xml:space="preserve">CP-02</w:t>
+            </w:r>
+          </w:p>
+        </w:tc>
+        <w:tc>
+          <w:tcPr>
+            <w:tcBorders>
+              <w:top w:color="000000" w:space="0" w:sz="0" w:val="nil"/>
+              <w:left w:color="000000" w:space="0" w:sz="0" w:val="nil"/>
+              <w:bottom w:color="000000" w:space="0" w:sz="0" w:val="nil"/>
+              <w:right w:color="000000" w:space="0" w:sz="0" w:val="nil"/>
+            </w:tcBorders>
+            <w:tcMar>
+              <w:top w:w="100.0" w:type="dxa"/>
+              <w:left w:w="100.0" w:type="dxa"/>
+              <w:bottom w:w="100.0" w:type="dxa"/>
+              <w:right w:w="100.0" w:type="dxa"/>
+            </w:tcMar>
+            <w:vAlign w:val="top"/>
+          </w:tcPr>
+          <w:p>
+            <w:pPr>
+              <w:rPr/>
+            </w:pPr>
+            <w:r>
+              <w:rPr>
+                <w:rtl w:val="0"/>
+              </w:rPr>
+              <w:t xml:space="preserve">Clientes</w:t>
+            </w:r>
+          </w:p>
+        </w:tc>
+        <w:tc>
+          <w:tcPr>
+            <w:tcBorders>
+              <w:top w:color="000000" w:space="0" w:sz="0" w:val="nil"/>
+              <w:left w:color="000000" w:space="0" w:sz="0" w:val="nil"/>
+              <w:bottom w:color="000000" w:space="0" w:sz="0" w:val="nil"/>
+              <w:right w:color="000000" w:space="0" w:sz="0" w:val="nil"/>
+            </w:tcBorders>
+            <w:tcMar>
+              <w:top w:w="100.0" w:type="dxa"/>
+              <w:left w:w="100.0" w:type="dxa"/>
+              <w:bottom w:w="100.0" w:type="dxa"/>
+              <w:right w:w="100.0" w:type="dxa"/>
+            </w:tcMar>
+            <w:vAlign w:val="top"/>
+          </w:tcPr>
+          <w:p>
+            <w:pPr>
+              <w:rPr/>
+            </w:pPr>
+            <w:r>
+              <w:rPr>
+                <w:rtl w:val="0"/>
+              </w:rPr>
+              <w:t xml:space="preserve">Registrar cliente válido</w:t>
+            </w:r>
+          </w:p>
+        </w:tc>
+        <w:tc>
+          <w:tcPr>
+            <w:tcBorders>
+              <w:top w:color="000000" w:space="0" w:sz="0" w:val="nil"/>
+              <w:left w:color="000000" w:space="0" w:sz="0" w:val="nil"/>
+              <w:bottom w:color="000000" w:space="0" w:sz="0" w:val="nil"/>
+              <w:right w:color="000000" w:space="0" w:sz="0" w:val="nil"/>
+            </w:tcBorders>
+            <w:tcMar>
+              <w:top w:w="100.0" w:type="dxa"/>
+              <w:left w:w="100.0" w:type="dxa"/>
+              <w:bottom w:w="100.0" w:type="dxa"/>
+              <w:right w:w="100.0" w:type="dxa"/>
+            </w:tcMar>
+            <w:vAlign w:val="top"/>
+          </w:tcPr>
+          <w:p>
+            <w:pPr>
+              <w:rPr/>
+            </w:pPr>
+            <w:r>
+              <w:rPr>
+                <w:rtl w:val="0"/>
+              </w:rPr>
+              <w:t xml:space="preserve">Sistema en ejecución</w:t>
+            </w:r>
+          </w:p>
+        </w:tc>
+        <w:tc>
+          <w:tcPr>
+            <w:tcBorders>
+              <w:top w:color="000000" w:space="0" w:sz="0" w:val="nil"/>
+              <w:left w:color="000000" w:space="0" w:sz="0" w:val="nil"/>
+              <w:bottom w:color="000000" w:space="0" w:sz="0" w:val="nil"/>
+              <w:right w:color="000000" w:space="0" w:sz="0" w:val="nil"/>
+            </w:tcBorders>
+            <w:tcMar>
+              <w:top w:w="100.0" w:type="dxa"/>
+              <w:left w:w="100.0" w:type="dxa"/>
+              <w:bottom w:w="100.0" w:type="dxa"/>
+              <w:right w:w="100.0" w:type="dxa"/>
+            </w:tcMar>
+            <w:vAlign w:val="top"/>
+          </w:tcPr>
+          <w:p>
+            <w:pPr>
+              <w:rPr/>
+            </w:pPr>
+            <w:r>
+              <w:rPr>
+                <w:rtl w:val="0"/>
+              </w:rPr>
+              <w:t xml:space="preserve">Ir a Clientes, pulsar Crear, completar formulario, guardar</w:t>
+            </w:r>
+          </w:p>
+        </w:tc>
+        <w:tc>
+          <w:tcPr>
+            <w:tcBorders>
+              <w:top w:color="000000" w:space="0" w:sz="0" w:val="nil"/>
+              <w:left w:color="000000" w:space="0" w:sz="0" w:val="nil"/>
+              <w:bottom w:color="000000" w:space="0" w:sz="0" w:val="nil"/>
+              <w:right w:color="000000" w:space="0" w:sz="0" w:val="nil"/>
+            </w:tcBorders>
+            <w:tcMar>
+              <w:top w:w="100.0" w:type="dxa"/>
+              <w:left w:w="100.0" w:type="dxa"/>
+              <w:bottom w:w="100.0" w:type="dxa"/>
+              <w:right w:w="100.0" w:type="dxa"/>
+            </w:tcMar>
+            <w:vAlign w:val="top"/>
+          </w:tcPr>
+          <w:p>
+            <w:pPr>
+              <w:rPr/>
+            </w:pPr>
+            <w:r>
+              <w:rPr>
+                <w:rtl w:val="0"/>
+              </w:rPr>
+              <w:t xml:space="preserve">Juan, Pérez, juan@email.com, 8095551234, 00112345678</w:t>
+            </w:r>
+          </w:p>
+        </w:tc>
+        <w:tc>
+          <w:tcPr>
+            <w:tcBorders>
+              <w:top w:color="000000" w:space="0" w:sz="0" w:val="nil"/>
+              <w:left w:color="000000" w:space="0" w:sz="0" w:val="nil"/>
+              <w:bottom w:color="000000" w:space="0" w:sz="0" w:val="nil"/>
+              <w:right w:color="000000" w:space="0" w:sz="0" w:val="nil"/>
+            </w:tcBorders>
+            <w:tcMar>
+              <w:top w:w="100.0" w:type="dxa"/>
+              <w:left w:w="100.0" w:type="dxa"/>
+              <w:bottom w:w="100.0" w:type="dxa"/>
+              <w:right w:w="100.0" w:type="dxa"/>
+            </w:tcMar>
+            <w:vAlign w:val="top"/>
+          </w:tcPr>
+          <w:p>
+            <w:pPr>
+              <w:rPr/>
+            </w:pPr>
+            <w:r>
+              <w:rPr>
+                <w:rtl w:val="0"/>
+              </w:rPr>
+              <w:t xml:space="preserve">El cliente se guarda y aparece en el listado</w:t>
+            </w:r>
+          </w:p>
+        </w:tc>
+        <w:tc>
+          <w:tcPr>
+            <w:tcBorders>
+              <w:top w:color="000000" w:space="0" w:sz="0" w:val="nil"/>
+              <w:left w:color="000000" w:space="0" w:sz="0" w:val="nil"/>
+              <w:bottom w:color="000000" w:space="0" w:sz="0" w:val="nil"/>
+              <w:right w:color="000000" w:space="0" w:sz="0" w:val="nil"/>
+            </w:tcBorders>
+            <w:tcMar>
+              <w:top w:w="100.0" w:type="dxa"/>
+              <w:left w:w="100.0" w:type="dxa"/>
+              <w:bottom w:w="100.0" w:type="dxa"/>
+              <w:right w:w="100.0" w:type="dxa"/>
+            </w:tcMar>
+            <w:vAlign w:val="top"/>
+          </w:tcPr>
+          <w:p>
+            <w:pPr>
+              <w:rPr/>
+            </w:pPr>
+            <w:r>
+              <w:rPr>
+                <w:rtl w:val="0"/>
+              </w:rPr>
+              <w:t xml:space="preserve">Exitoso</w:t>
+            </w:r>
+          </w:p>
+        </w:tc>
+        <w:tc>
+          <w:tcPr>
+            <w:tcBorders>
+              <w:top w:color="000000" w:space="0" w:sz="0" w:val="nil"/>
+              <w:left w:color="000000" w:space="0" w:sz="0" w:val="nil"/>
+              <w:bottom w:color="000000" w:space="0" w:sz="0" w:val="nil"/>
+              <w:right w:color="000000" w:space="0" w:sz="0" w:val="nil"/>
+            </w:tcBorders>
+            <w:tcMar>
+              <w:top w:w="100.0" w:type="dxa"/>
+              <w:left w:w="100.0" w:type="dxa"/>
+              <w:bottom w:w="100.0" w:type="dxa"/>
+              <w:right w:w="100.0" w:type="dxa"/>
+            </w:tcMar>
+            <w:vAlign w:val="top"/>
+          </w:tcPr>
+          <w:p>
+            <w:pPr>
+              <w:rPr/>
+            </w:pPr>
+            <w:r>
+              <w:rPr>
+                <w:rtl w:val="0"/>
+              </w:rPr>
+              <w:t xml:space="preserve">Aprobado</w:t>
+            </w:r>
+          </w:p>
+        </w:tc>
+      </w:tr>
+    </w:tbl>
+    <w:p>
+      <w:pPr>
+        <w:rPr/>
+      </w:pPr>
+      <w:r>
+        <w:rPr>
+          <w:rtl w:val="0"/>
+        </w:rPr>
+      </w:r>
+    </w:p>
+    <w:tbl>
+      <w:tblPr>
+        <w:tblStyle w:val="Table7"/>
+        <w:tblW w:w="9025.511811023624" w:type="dxa"/>
+        <w:jc w:val="left"/>
+        <w:tblBorders>
+          <w:top w:color="000000" w:space="0" w:sz="0" w:val="nil"/>
+          <w:left w:color="000000" w:space="0" w:sz="0" w:val="nil"/>
+          <w:bottom w:color="000000" w:space="0" w:sz="0" w:val="nil"/>
+          <w:right w:color="000000" w:space="0" w:sz="0" w:val="nil"/>
+          <w:insideH w:color="000000" w:space="0" w:sz="0" w:val="nil"/>
+          <w:insideV w:color="000000" w:space="0" w:sz="0" w:val="nil"/>
+        </w:tblBorders>
+        <w:tblLayout w:type="fixed"/>
+        <w:tblLook w:val="0600"/>
+      </w:tblPr>
+      <w:tblGrid>
+        <w:gridCol w:w="473.996062992126"/>
+        <w:gridCol w:w="1261.3779527559057"/>
+        <w:gridCol w:w="1049.8425196850394"/>
+        <w:gridCol w:w="1108.6023622047244"/>
+        <w:gridCol w:w="1308.3858267716537"/>
+        <w:gridCol w:w="1085.0984251968505"/>
+        <w:gridCol w:w="1049.8425196850394"/>
+        <w:gridCol w:w="756.0433070866143"/>
+        <w:gridCol w:w="932.3228346456693"/>
+        <w:tblGridChange w:id="0">
+          <w:tblGrid>
+            <w:gridCol w:w="473.996062992126"/>
+            <w:gridCol w:w="1261.3779527559057"/>
+            <w:gridCol w:w="1049.8425196850394"/>
+            <w:gridCol w:w="1108.6023622047244"/>
+            <w:gridCol w:w="1308.3858267716537"/>
+            <w:gridCol w:w="1085.0984251968505"/>
+            <w:gridCol w:w="1049.8425196850394"/>
+            <w:gridCol w:w="756.0433070866143"/>
+            <w:gridCol w:w="932.3228346456693"/>
+          </w:tblGrid>
+        </w:tblGridChange>
+      </w:tblGrid>
+      <w:tr>
+        <w:trPr>
+          <w:cantSplit w:val="0"/>
+          <w:trHeight w:val="2720" w:hRule="atLeast"/>
+          <w:tblHeader w:val="0"/>
+        </w:trPr>
+        <w:tc>
+          <w:tcPr>
+            <w:tcBorders>
+              <w:top w:color="000000" w:space="0" w:sz="0" w:val="nil"/>
+              <w:left w:color="000000" w:space="0" w:sz="0" w:val="nil"/>
+              <w:bottom w:color="000000" w:space="0" w:sz="0" w:val="nil"/>
+              <w:right w:color="000000" w:space="0" w:sz="0" w:val="nil"/>
+            </w:tcBorders>
+            <w:tcMar>
+              <w:top w:w="100.0" w:type="dxa"/>
+              <w:left w:w="100.0" w:type="dxa"/>
+              <w:bottom w:w="100.0" w:type="dxa"/>
+              <w:right w:w="100.0" w:type="dxa"/>
+            </w:tcMar>
+            <w:vAlign w:val="top"/>
+          </w:tcPr>
+          <w:p>
+            <w:pPr>
+              <w:rPr/>
+            </w:pPr>
+            <w:r>
+              <w:rPr>
+                <w:rtl w:val="0"/>
+              </w:rPr>
+              <w:t xml:space="preserve">CP-03</w:t>
+            </w:r>
+          </w:p>
+        </w:tc>
+        <w:tc>
+          <w:tcPr>
+            <w:tcBorders>
+              <w:top w:color="000000" w:space="0" w:sz="0" w:val="nil"/>
+              <w:left w:color="000000" w:space="0" w:sz="0" w:val="nil"/>
+              <w:bottom w:color="000000" w:space="0" w:sz="0" w:val="nil"/>
+              <w:right w:color="000000" w:space="0" w:sz="0" w:val="nil"/>
+            </w:tcBorders>
+            <w:tcMar>
+              <w:top w:w="100.0" w:type="dxa"/>
+              <w:left w:w="100.0" w:type="dxa"/>
+              <w:bottom w:w="100.0" w:type="dxa"/>
+              <w:right w:w="100.0" w:type="dxa"/>
+            </w:tcMar>
+            <w:vAlign w:val="top"/>
+          </w:tcPr>
+          <w:p>
+            <w:pPr>
+              <w:rPr/>
+            </w:pPr>
+            <w:r>
+              <w:rPr>
+                <w:rtl w:val="0"/>
+              </w:rPr>
+              <w:t xml:space="preserve">Reservaciones</w:t>
+            </w:r>
+          </w:p>
+        </w:tc>
+        <w:tc>
+          <w:tcPr>
+            <w:tcBorders>
+              <w:top w:color="000000" w:space="0" w:sz="0" w:val="nil"/>
+              <w:left w:color="000000" w:space="0" w:sz="0" w:val="nil"/>
+              <w:bottom w:color="000000" w:space="0" w:sz="0" w:val="nil"/>
+              <w:right w:color="000000" w:space="0" w:sz="0" w:val="nil"/>
+            </w:tcBorders>
+            <w:tcMar>
+              <w:top w:w="100.0" w:type="dxa"/>
+              <w:left w:w="100.0" w:type="dxa"/>
+              <w:bottom w:w="100.0" w:type="dxa"/>
+              <w:right w:w="100.0" w:type="dxa"/>
+            </w:tcMar>
+            <w:vAlign w:val="top"/>
+          </w:tcPr>
+          <w:p>
+            <w:pPr>
+              <w:rPr/>
+            </w:pPr>
+            <w:r>
+              <w:rPr>
+                <w:rtl w:val="0"/>
+              </w:rPr>
+              <w:t xml:space="preserve">Crear reservación válida</w:t>
+            </w:r>
+          </w:p>
+        </w:tc>
+        <w:tc>
+          <w:tcPr>
+            <w:tcBorders>
+              <w:top w:color="000000" w:space="0" w:sz="0" w:val="nil"/>
+              <w:left w:color="000000" w:space="0" w:sz="0" w:val="nil"/>
+              <w:bottom w:color="000000" w:space="0" w:sz="0" w:val="nil"/>
+              <w:right w:color="000000" w:space="0" w:sz="0" w:val="nil"/>
+            </w:tcBorders>
+            <w:tcMar>
+              <w:top w:w="100.0" w:type="dxa"/>
+              <w:left w:w="100.0" w:type="dxa"/>
+              <w:bottom w:w="100.0" w:type="dxa"/>
+              <w:right w:w="100.0" w:type="dxa"/>
+            </w:tcMar>
+            <w:vAlign w:val="top"/>
+          </w:tcPr>
+          <w:p>
+            <w:pPr>
+              <w:rPr/>
+            </w:pPr>
+            <w:r>
+              <w:rPr>
+                <w:rtl w:val="0"/>
+              </w:rPr>
+              <w:t xml:space="preserve">Cliente y habitación previamente creados</w:t>
+            </w:r>
+          </w:p>
+        </w:tc>
+        <w:tc>
+          <w:tcPr>
+            <w:tcBorders>
+              <w:top w:color="000000" w:space="0" w:sz="0" w:val="nil"/>
+              <w:left w:color="000000" w:space="0" w:sz="0" w:val="nil"/>
+              <w:bottom w:color="000000" w:space="0" w:sz="0" w:val="nil"/>
+              <w:right w:color="000000" w:space="0" w:sz="0" w:val="nil"/>
+            </w:tcBorders>
+            <w:tcMar>
+              <w:top w:w="100.0" w:type="dxa"/>
+              <w:left w:w="100.0" w:type="dxa"/>
+              <w:bottom w:w="100.0" w:type="dxa"/>
+              <w:right w:w="100.0" w:type="dxa"/>
+            </w:tcMar>
+            <w:vAlign w:val="top"/>
+          </w:tcPr>
+          <w:p>
+            <w:pPr>
+              <w:rPr/>
+            </w:pPr>
+            <w:r>
+              <w:rPr>
+                <w:rtl w:val="0"/>
+              </w:rPr>
+              <w:t xml:space="preserve">Ir a Reservaciones, pulsar Crear, seleccionar cliente y habitación, ingresar fechas, guardar</w:t>
+            </w:r>
+          </w:p>
+        </w:tc>
+        <w:tc>
+          <w:tcPr>
+            <w:tcBorders>
+              <w:top w:color="000000" w:space="0" w:sz="0" w:val="nil"/>
+              <w:left w:color="000000" w:space="0" w:sz="0" w:val="nil"/>
+              <w:bottom w:color="000000" w:space="0" w:sz="0" w:val="nil"/>
+              <w:right w:color="000000" w:space="0" w:sz="0" w:val="nil"/>
+            </w:tcBorders>
+            <w:tcMar>
+              <w:top w:w="100.0" w:type="dxa"/>
+              <w:left w:w="100.0" w:type="dxa"/>
+              <w:bottom w:w="100.0" w:type="dxa"/>
+              <w:right w:w="100.0" w:type="dxa"/>
+            </w:tcMar>
+            <w:vAlign w:val="top"/>
+          </w:tcPr>
+          <w:p>
+            <w:pPr>
+              <w:rPr/>
+            </w:pPr>
+            <w:r>
+              <w:rPr>
+                <w:rtl w:val="0"/>
+              </w:rPr>
+              <w:t xml:space="preserve">Cliente Juan Pérez, Habitación 101, 14/04/2026, 16/04/2026, Activa</w:t>
+            </w:r>
+          </w:p>
+        </w:tc>
+        <w:tc>
+          <w:tcPr>
+            <w:tcBorders>
+              <w:top w:color="000000" w:space="0" w:sz="0" w:val="nil"/>
+              <w:left w:color="000000" w:space="0" w:sz="0" w:val="nil"/>
+              <w:bottom w:color="000000" w:space="0" w:sz="0" w:val="nil"/>
+              <w:right w:color="000000" w:space="0" w:sz="0" w:val="nil"/>
+            </w:tcBorders>
+            <w:tcMar>
+              <w:top w:w="100.0" w:type="dxa"/>
+              <w:left w:w="100.0" w:type="dxa"/>
+              <w:bottom w:w="100.0" w:type="dxa"/>
+              <w:right w:w="100.0" w:type="dxa"/>
+            </w:tcMar>
+            <w:vAlign w:val="top"/>
+          </w:tcPr>
+          <w:p>
+            <w:pPr>
+              <w:rPr/>
+            </w:pPr>
+            <w:r>
+              <w:rPr>
+                <w:rtl w:val="0"/>
+              </w:rPr>
+              <w:t xml:space="preserve">La reservación se guarda y aparece en el listado</w:t>
+            </w:r>
+          </w:p>
+        </w:tc>
+        <w:tc>
+          <w:tcPr>
+            <w:tcBorders>
+              <w:top w:color="000000" w:space="0" w:sz="0" w:val="nil"/>
+              <w:left w:color="000000" w:space="0" w:sz="0" w:val="nil"/>
+              <w:bottom w:color="000000" w:space="0" w:sz="0" w:val="nil"/>
+              <w:right w:color="000000" w:space="0" w:sz="0" w:val="nil"/>
+            </w:tcBorders>
+            <w:tcMar>
+              <w:top w:w="100.0" w:type="dxa"/>
+              <w:left w:w="100.0" w:type="dxa"/>
+              <w:bottom w:w="100.0" w:type="dxa"/>
+              <w:right w:w="100.0" w:type="dxa"/>
+            </w:tcMar>
+            <w:vAlign w:val="top"/>
+          </w:tcPr>
+          <w:p>
+            <w:pPr>
+              <w:rPr/>
+            </w:pPr>
+            <w:r>
+              <w:rPr>
+                <w:rtl w:val="0"/>
+              </w:rPr>
+              <w:t xml:space="preserve">Exitoso</w:t>
+            </w:r>
+          </w:p>
+        </w:tc>
+        <w:tc>
+          <w:tcPr>
+            <w:tcBorders>
+              <w:top w:color="000000" w:space="0" w:sz="0" w:val="nil"/>
+              <w:left w:color="000000" w:space="0" w:sz="0" w:val="nil"/>
+              <w:bottom w:color="000000" w:space="0" w:sz="0" w:val="nil"/>
+              <w:right w:color="000000" w:space="0" w:sz="0" w:val="nil"/>
+            </w:tcBorders>
+            <w:tcMar>
+              <w:top w:w="100.0" w:type="dxa"/>
+              <w:left w:w="100.0" w:type="dxa"/>
+              <w:bottom w:w="100.0" w:type="dxa"/>
+              <w:right w:w="100.0" w:type="dxa"/>
+            </w:tcMar>
+            <w:vAlign w:val="top"/>
+          </w:tcPr>
+          <w:p>
+            <w:pPr>
+              <w:rPr/>
+            </w:pPr>
+            <w:r>
+              <w:rPr>
+                <w:rtl w:val="0"/>
+              </w:rPr>
+              <w:t xml:space="preserve">Aprobado</w:t>
+            </w:r>
+          </w:p>
+        </w:tc>
+      </w:tr>
+    </w:tbl>
+    <w:p>
+      <w:pPr>
+        <w:rPr/>
+      </w:pPr>
+      <w:r>
+        <w:rPr>
+          <w:rtl w:val="0"/>
+        </w:rPr>
+      </w:r>
+    </w:p>
+    <w:tbl>
+      <w:tblPr>
+        <w:tblStyle w:val="Table8"/>
+        <w:tblW w:w="9025.511811023622" w:type="dxa"/>
+        <w:jc w:val="left"/>
+        <w:tblBorders>
+          <w:top w:color="000000" w:space="0" w:sz="0" w:val="nil"/>
+          <w:left w:color="000000" w:space="0" w:sz="0" w:val="nil"/>
+          <w:bottom w:color="000000" w:space="0" w:sz="0" w:val="nil"/>
+          <w:right w:color="000000" w:space="0" w:sz="0" w:val="nil"/>
+          <w:insideH w:color="000000" w:space="0" w:sz="0" w:val="nil"/>
+          <w:insideV w:color="000000" w:space="0" w:sz="0" w:val="nil"/>
+        </w:tblBorders>
+        <w:tblLayout w:type="fixed"/>
+        <w:tblLook w:val="0600"/>
+      </w:tblPr>
+      <w:tblGrid>
+        <w:gridCol w:w="531.6878914965231"/>
+        <w:gridCol w:w="1414.9049674535572"/>
+        <w:gridCol w:w="900.7935351800597"/>
+        <w:gridCol w:w="1296.2638676981348"/>
+        <w:gridCol w:w="1586.2754448780563"/>
+        <w:gridCol w:w="1269.8991788635963"/>
+        <w:gridCol w:w="1177.6227679427122"/>
+        <w:gridCol w:w="848.064157510983"/>
+        <w:tblGridChange w:id="0">
+          <w:tblGrid>
+            <w:gridCol w:w="531.6878914965231"/>
+            <w:gridCol w:w="1414.9049674535572"/>
+            <w:gridCol w:w="900.7935351800597"/>
+            <w:gridCol w:w="1296.2638676981348"/>
+            <w:gridCol w:w="1586.2754448780563"/>
+            <w:gridCol w:w="1269.8991788635963"/>
+            <w:gridCol w:w="1177.6227679427122"/>
+            <w:gridCol w:w="848.064157510983"/>
+          </w:tblGrid>
+        </w:tblGridChange>
+      </w:tblGrid>
+      <w:tr>
+        <w:trPr>
+          <w:cantSplit w:val="0"/>
+          <w:trHeight w:val="1880" w:hRule="atLeast"/>
+          <w:tblHeader w:val="0"/>
+        </w:trPr>
+        <w:tc>
+          <w:tcPr>
+            <w:tcBorders>
+              <w:top w:color="000000" w:space="0" w:sz="0" w:val="nil"/>
+              <w:left w:color="000000" w:space="0" w:sz="0" w:val="nil"/>
+              <w:bottom w:color="000000" w:space="0" w:sz="0" w:val="nil"/>
+              <w:right w:color="000000" w:space="0" w:sz="0" w:val="nil"/>
+            </w:tcBorders>
+            <w:tcMar>
+              <w:top w:w="100.0" w:type="dxa"/>
+              <w:left w:w="100.0" w:type="dxa"/>
+              <w:bottom w:w="100.0" w:type="dxa"/>
+              <w:right w:w="100.0" w:type="dxa"/>
+            </w:tcMar>
+            <w:vAlign w:val="top"/>
+          </w:tcPr>
+          <w:p>
+            <w:pPr>
+              <w:rPr/>
+            </w:pPr>
+            <w:r>
+              <w:rPr>
+                <w:rtl w:val="0"/>
+              </w:rPr>
+              <w:t xml:space="preserve">CP-04</w:t>
+            </w:r>
+          </w:p>
+        </w:tc>
+        <w:tc>
+          <w:tcPr>
+            <w:tcBorders>
+              <w:top w:color="000000" w:space="0" w:sz="0" w:val="nil"/>
+              <w:left w:color="000000" w:space="0" w:sz="0" w:val="nil"/>
+              <w:bottom w:color="000000" w:space="0" w:sz="0" w:val="nil"/>
+              <w:right w:color="000000" w:space="0" w:sz="0" w:val="nil"/>
+            </w:tcBorders>
+            <w:tcMar>
+              <w:top w:w="100.0" w:type="dxa"/>
+              <w:left w:w="100.0" w:type="dxa"/>
+              <w:bottom w:w="100.0" w:type="dxa"/>
+              <w:right w:w="100.0" w:type="dxa"/>
+            </w:tcMar>
+            <w:vAlign w:val="top"/>
+          </w:tcPr>
+          <w:p>
+            <w:pPr>
+              <w:rPr/>
+            </w:pPr>
+            <w:r>
+              <w:rPr>
+                <w:rtl w:val="0"/>
+              </w:rPr>
+              <w:t xml:space="preserve">Reservaciones</w:t>
+            </w:r>
+          </w:p>
+        </w:tc>
+        <w:tc>
+          <w:tcPr>
+            <w:tcBorders>
+              <w:top w:color="000000" w:space="0" w:sz="0" w:val="nil"/>
+              <w:left w:color="000000" w:space="0" w:sz="0" w:val="nil"/>
+              <w:bottom w:color="000000" w:space="0" w:sz="0" w:val="nil"/>
+              <w:right w:color="000000" w:space="0" w:sz="0" w:val="nil"/>
+            </w:tcBorders>
+            <w:tcMar>
+              <w:top w:w="100.0" w:type="dxa"/>
+              <w:left w:w="100.0" w:type="dxa"/>
+              <w:bottom w:w="100.0" w:type="dxa"/>
+              <w:right w:w="100.0" w:type="dxa"/>
+            </w:tcMar>
+            <w:vAlign w:val="top"/>
+          </w:tcPr>
+          <w:p>
+            <w:pPr>
+              <w:rPr/>
+            </w:pPr>
+            <w:r>
+              <w:rPr>
+                <w:rtl w:val="0"/>
+              </w:rPr>
+              <w:t xml:space="preserve">Validar fecha inválida</w:t>
+            </w:r>
+          </w:p>
+        </w:tc>
+        <w:tc>
+          <w:tcPr>
+            <w:tcBorders>
+              <w:top w:color="000000" w:space="0" w:sz="0" w:val="nil"/>
+              <w:left w:color="000000" w:space="0" w:sz="0" w:val="nil"/>
+              <w:bottom w:color="000000" w:space="0" w:sz="0" w:val="nil"/>
+              <w:right w:color="000000" w:space="0" w:sz="0" w:val="nil"/>
+            </w:tcBorders>
+            <w:tcMar>
+              <w:top w:w="100.0" w:type="dxa"/>
+              <w:left w:w="100.0" w:type="dxa"/>
+              <w:bottom w:w="100.0" w:type="dxa"/>
+              <w:right w:w="100.0" w:type="dxa"/>
+            </w:tcMar>
+            <w:vAlign w:val="top"/>
+          </w:tcPr>
+          <w:p>
+            <w:pPr>
+              <w:rPr/>
+            </w:pPr>
+            <w:r>
+              <w:rPr>
+                <w:rtl w:val="0"/>
+              </w:rPr>
+              <w:t xml:space="preserve">Cliente y habitación previamente creados</w:t>
+            </w:r>
+          </w:p>
+        </w:tc>
+        <w:tc>
+          <w:tcPr>
+            <w:tcBorders>
+              <w:top w:color="000000" w:space="0" w:sz="0" w:val="nil"/>
+              <w:left w:color="000000" w:space="0" w:sz="0" w:val="nil"/>
+              <w:bottom w:color="000000" w:space="0" w:sz="0" w:val="nil"/>
+              <w:right w:color="000000" w:space="0" w:sz="0" w:val="nil"/>
+            </w:tcBorders>
+            <w:tcMar>
+              <w:top w:w="100.0" w:type="dxa"/>
+              <w:left w:w="100.0" w:type="dxa"/>
+              <w:bottom w:w="100.0" w:type="dxa"/>
+              <w:right w:w="100.0" w:type="dxa"/>
+            </w:tcMar>
+            <w:vAlign w:val="top"/>
+          </w:tcPr>
+          <w:p>
+            <w:pPr>
+              <w:rPr/>
+            </w:pPr>
+            <w:r>
+              <w:rPr>
+                <w:rtl w:val="0"/>
+              </w:rPr>
+              <w:t xml:space="preserve">Ir a Reservaciones, pulsar Crear, colocar fecha de salida menor o igual a entrada</w:t>
+            </w:r>
+          </w:p>
+        </w:tc>
+        <w:tc>
+          <w:tcPr>
+            <w:tcBorders>
+              <w:top w:color="000000" w:space="0" w:sz="0" w:val="nil"/>
+              <w:left w:color="000000" w:space="0" w:sz="0" w:val="nil"/>
+              <w:bottom w:color="000000" w:space="0" w:sz="0" w:val="nil"/>
+              <w:right w:color="000000" w:space="0" w:sz="0" w:val="nil"/>
+            </w:tcBorders>
+            <w:tcMar>
+              <w:top w:w="100.0" w:type="dxa"/>
+              <w:left w:w="100.0" w:type="dxa"/>
+              <w:bottom w:w="100.0" w:type="dxa"/>
+              <w:right w:w="100.0" w:type="dxa"/>
+            </w:tcMar>
+            <w:vAlign w:val="top"/>
+          </w:tcPr>
+          <w:p>
+            <w:pPr>
+              <w:rPr/>
+            </w:pPr>
+            <w:r>
+              <w:rPr>
+                <w:rtl w:val="0"/>
+              </w:rPr>
+              <w:t xml:space="preserve">Entrada: 16/04/2026, Salida: 15/04/2026</w:t>
+            </w:r>
+          </w:p>
+        </w:tc>
+        <w:tc>
+          <w:tcPr>
+            <w:tcBorders>
+              <w:top w:color="000000" w:space="0" w:sz="0" w:val="nil"/>
+              <w:left w:color="000000" w:space="0" w:sz="0" w:val="nil"/>
+              <w:bottom w:color="000000" w:space="0" w:sz="0" w:val="nil"/>
+              <w:right w:color="000000" w:space="0" w:sz="0" w:val="nil"/>
+            </w:tcBorders>
+            <w:tcMar>
+              <w:top w:w="100.0" w:type="dxa"/>
+              <w:left w:w="100.0" w:type="dxa"/>
+              <w:bottom w:w="100.0" w:type="dxa"/>
+              <w:right w:w="100.0" w:type="dxa"/>
+            </w:tcMar>
+            <w:vAlign w:val="top"/>
+          </w:tcPr>
+          <w:p>
+            <w:pPr>
+              <w:rPr/>
+            </w:pPr>
+            <w:r>
+              <w:rPr>
+                <w:rtl w:val="0"/>
+              </w:rPr>
+              <w:t xml:space="preserve">El sistema rechaza la operación y muestra error de validación</w:t>
+            </w:r>
+          </w:p>
+        </w:tc>
+        <w:tc>
+          <w:tcPr>
+            <w:tcBorders>
+              <w:top w:color="000000" w:space="0" w:sz="0" w:val="nil"/>
+              <w:left w:color="000000" w:space="0" w:sz="0" w:val="nil"/>
+              <w:bottom w:color="000000" w:space="0" w:sz="0" w:val="nil"/>
+              <w:right w:color="000000" w:space="0" w:sz="0" w:val="nil"/>
+            </w:tcBorders>
+            <w:tcMar>
+              <w:top w:w="100.0" w:type="dxa"/>
+              <w:left w:w="100.0" w:type="dxa"/>
+              <w:bottom w:w="100.0" w:type="dxa"/>
+              <w:right w:w="100.0" w:type="dxa"/>
+            </w:tcMar>
+            <w:vAlign w:val="top"/>
+          </w:tcPr>
+          <w:p>
+            <w:pPr>
+              <w:rPr/>
+            </w:pPr>
+            <w:r>
+              <w:rPr>
+                <w:rtl w:val="0"/>
+              </w:rPr>
+              <w:t xml:space="preserve">Exitoso</w:t>
+            </w:r>
+          </w:p>
+        </w:tc>
+      </w:tr>
+    </w:tbl>
+    <w:p>
+      <w:pPr>
+        <w:rPr/>
+      </w:pPr>
+      <w:r>
+        <w:rPr>
+          <w:rtl w:val="0"/>
+        </w:rPr>
+      </w:r>
+    </w:p>
+    <w:p>
+      <w:pPr>
+        <w:pStyle w:val="Heading2"/>
+        <w:keepNext w:val="0"/>
+        <w:keepLines w:val="0"/>
+        <w:spacing w:after="80" w:lineRule="auto"/>
+        <w:rPr>
+          <w:b w:val="1"/>
+          <w:bCs w:val="1"/>
+          <w:sz w:val="34"/>
+          <w:szCs w:val="34"/>
+        </w:rPr>
+      </w:pPr>
+      <w:bookmarkStart w:colFirst="0" w:colLast="0" w:name="_g1gwn0frg8v8" w:id="13"/>
+      <w:bookmarkEnd w:id="13"/>
+      <w:r>
+        <w:rPr>
+          <w:b w:val="1"/>
+          <w:bCs w:val="1"/>
+          <w:sz w:val="34"/>
+          <w:szCs w:val="34"/>
+          <w:rtl w:val="0"/>
+        </w:rPr>
+        <w:t xml:space="preserve">4.6 Equipos de pruebas y responsabilidades</w:t>
+      </w:r>
+    </w:p>
+    <w:p>
+      <w:pPr>
+        <w:rPr/>
+      </w:pPr>
+      <w:r>
+        <w:rPr>
+          <w:rtl w:val="0"/>
+        </w:rPr>
+        <w:t xml:space="preserve">Debido a que el proyecto es de carácter académico e individual, una sola persona asumirá múltiples responsabilidades dentro del proceso de pruebas.</w:t>
+      </w:r>
+    </w:p>
+    <w:p>
+      <w:pPr>
+        <w:rPr/>
+      </w:pPr>
+      <w:r>
+        <w:rPr>
+          <w:rtl w:val="0"/>
+        </w:rPr>
+      </w:r>
+    </w:p>
+    <w:p>
+      <w:pPr>
+        <w:rPr/>
+      </w:pPr>
+      <w:r>
+        <w:rPr>
+          <w:rtl w:val="0"/>
+        </w:rPr>
+        <w:t xml:space="preserve">Responsabilidades:</w:t>
+      </w:r>
+    </w:p>
+    <w:p>
+      <w:pPr>
+        <w:rPr/>
+      </w:pPr>
+      <w:r>
+        <w:rPr>
+          <w:rtl w:val="0"/>
+        </w:rPr>
+        <w:t xml:space="preserve">- Diseñar casos de prueba.</w:t>
+      </w:r>
+    </w:p>
+    <w:p>
+      <w:pPr>
+        <w:rPr/>
+      </w:pPr>
+      <w:r>
+        <w:rPr>
+          <w:rtl w:val="0"/>
+        </w:rPr>
+        <w:t xml:space="preserve">- Ejecutar pruebas funcionales manuales.</w:t>
+      </w:r>
+    </w:p>
+    <w:p>
+      <w:pPr>
+        <w:rPr/>
+      </w:pPr>
+      <w:r>
+        <w:rPr>
+          <w:rtl w:val="0"/>
+        </w:rPr>
+        <w:t xml:space="preserve">- Verificar resultados en interfaz y base de datos.</w:t>
+      </w:r>
+    </w:p>
+    <w:p>
+      <w:pPr>
+        <w:rPr/>
+      </w:pPr>
+      <w:r>
+        <w:rPr>
+          <w:rtl w:val="0"/>
+        </w:rPr>
+        <w:t xml:space="preserve">- Automatizar flujos básicos del sistema.</w:t>
+      </w:r>
+    </w:p>
+    <w:p>
+      <w:pPr>
+        <w:rPr/>
+      </w:pPr>
+      <w:r>
+        <w:rPr>
+          <w:rtl w:val="0"/>
+        </w:rPr>
+        <w:t xml:space="preserve">- Registrar evidencias de ejecución.</w:t>
+      </w:r>
+    </w:p>
+    <w:p>
+      <w:pPr>
+        <w:rPr/>
+      </w:pPr>
+      <w:r>
+        <w:rPr>
+          <w:rtl w:val="0"/>
+        </w:rPr>
+        <w:t xml:space="preserve">- Corregir defectos detectados durante la validación.</w:t>
+      </w:r>
+    </w:p>
+    <w:p>
+      <w:pPr>
+        <w:rPr/>
+      </w:pPr>
+      <w:r>
+        <w:rPr>
+          <w:rtl w:val="0"/>
+        </w:rPr>
+      </w:r>
+    </w:p>
+    <w:p>
+      <w:pPr>
+        <w:rPr/>
+      </w:pPr>
+      <w:r>
+        <w:rPr>
+          <w:rtl w:val="0"/>
+        </w:rPr>
+        <w:t xml:space="preserve">Responsable general:</w:t>
+      </w:r>
+    </w:p>
+    <w:p>
+      <w:pPr>
+        <w:rPr/>
+      </w:pPr>
+      <w:r>
+        <w:rPr>
+          <w:rtl w:val="0"/>
+        </w:rPr>
+        <w:t xml:space="preserve">Raymel Guerrero</w:t>
+      </w:r>
+    </w:p>
+    <w:p>
+      <w:pPr>
+        <w:rPr/>
+      </w:pPr>
+      <w:r>
+        <w:rPr>
+          <w:rtl w:val="0"/>
+        </w:rPr>
+      </w:r>
+    </w:p>
+    <w:p>
+      <w:pPr>
+        <w:pStyle w:val="Heading2"/>
+        <w:keepNext w:val="0"/>
+        <w:keepLines w:val="0"/>
+        <w:spacing w:after="80" w:lineRule="auto"/>
+        <w:rPr>
+          <w:b w:val="1"/>
+          <w:bCs w:val="1"/>
+          <w:sz w:val="34"/>
+          <w:szCs w:val="34"/>
+        </w:rPr>
+      </w:pPr>
+      <w:bookmarkStart w:colFirst="0" w:colLast="0" w:name="_imjqo5vvr9fm" w:id="14"/>
+      <w:bookmarkEnd w:id="14"/>
+      <w:r>
+        <w:rPr>
+          <w:b w:val="1"/>
+          <w:bCs w:val="1"/>
+          <w:sz w:val="34"/>
+          <w:szCs w:val="34"/>
+          <w:rtl w:val="0"/>
+        </w:rPr>
+        <w:t xml:space="preserve">4.7 Plan de automatización de pruebas</w:t>
+      </w:r>
+    </w:p>
+    <w:p>
+      <w:pPr>
+        <w:rPr/>
+      </w:pPr>
+      <w:r>
+        <w:rPr>
+          <w:rtl w:val="0"/>
+        </w:rPr>
+        <w:t xml:space="preserve">El plan de automatización de pruebas estará enfocado en validar los flujos principales del sistema mediante Selenium WebDriver con C#. Se priorizarán aquellos procesos repetitivos y críticos para el funcionamiento del sistema.</w:t>
+      </w:r>
+    </w:p>
+    <w:p>
+      <w:pPr>
+        <w:rPr/>
+      </w:pPr>
+      <w:r>
+        <w:rPr>
+          <w:rtl w:val="0"/>
+        </w:rPr>
+      </w:r>
+    </w:p>
+    <w:p>
+      <w:pPr>
+        <w:rPr/>
+      </w:pPr>
+      <w:r>
+        <w:rPr>
+          <w:rtl w:val="0"/>
+        </w:rPr>
+        <w:t xml:space="preserve">Flujos a automatizar:</w:t>
+      </w:r>
+    </w:p>
+    <w:p>
+      <w:pPr>
+        <w:rPr/>
+      </w:pPr>
+      <w:r>
+        <w:rPr>
+          <w:rtl w:val="0"/>
+        </w:rPr>
+        <w:t xml:space="preserve">- Acceso al módulo de habitaciones.</w:t>
+      </w:r>
+    </w:p>
+    <w:p>
+      <w:pPr>
+        <w:rPr/>
+      </w:pPr>
+      <w:r>
+        <w:rPr>
+          <w:rtl w:val="0"/>
+        </w:rPr>
+        <w:t xml:space="preserve">- Registro de una nueva habitación.</w:t>
+      </w:r>
+    </w:p>
+    <w:p>
+      <w:pPr>
+        <w:rPr/>
+      </w:pPr>
+      <w:r>
+        <w:rPr>
+          <w:rtl w:val="0"/>
+        </w:rPr>
+        <w:t xml:space="preserve">- Acceso al módulo de clientes.</w:t>
+      </w:r>
+    </w:p>
+    <w:p>
+      <w:pPr>
+        <w:rPr/>
+      </w:pPr>
+      <w:r>
+        <w:rPr>
+          <w:rtl w:val="0"/>
+        </w:rPr>
+        <w:t xml:space="preserve">- Registro de un nuevo cliente.</w:t>
+      </w:r>
+    </w:p>
+    <w:p>
+      <w:pPr>
+        <w:rPr/>
+      </w:pPr>
+      <w:r>
+        <w:rPr>
+          <w:rtl w:val="0"/>
+        </w:rPr>
+        <w:t xml:space="preserve">- Acceso al módulo de reservaciones.</w:t>
+      </w:r>
+    </w:p>
+    <w:p>
+      <w:pPr>
+        <w:rPr/>
+      </w:pPr>
+      <w:r>
+        <w:rPr>
+          <w:rtl w:val="0"/>
+        </w:rPr>
+        <w:t xml:space="preserve">- Creación de una nueva reservación.</w:t>
+      </w:r>
+    </w:p>
+    <w:p>
+      <w:pPr>
+        <w:rPr/>
+      </w:pPr>
+      <w:r>
+        <w:rPr>
+          <w:rtl w:val="0"/>
+        </w:rPr>
+      </w:r>
+    </w:p>
+    <w:p>
+      <w:pPr>
+        <w:rPr/>
+      </w:pPr>
+      <w:r>
+        <w:rPr>
+          <w:rtl w:val="0"/>
+        </w:rPr>
+        <w:t xml:space="preserve">Estrategia:</w:t>
+      </w:r>
+    </w:p>
+    <w:p>
+      <w:pPr>
+        <w:rPr/>
+      </w:pPr>
+      <w:r>
+        <w:rPr>
+          <w:rtl w:val="0"/>
+        </w:rPr>
+        <w:t xml:space="preserve">- Crear un proyecto de pruebas automatizadas en C#.</w:t>
+      </w:r>
+    </w:p>
+    <w:p>
+      <w:pPr>
+        <w:rPr/>
+      </w:pPr>
+      <w:r>
+        <w:rPr>
+          <w:rtl w:val="0"/>
+        </w:rPr>
+        <w:t xml:space="preserve">- Automatizar flujos principales de creación y consulta.</w:t>
+      </w:r>
+    </w:p>
+    <w:p>
+      <w:pPr>
+        <w:rPr/>
+      </w:pPr>
+      <w:r>
+        <w:rPr>
+          <w:rtl w:val="0"/>
+        </w:rPr>
+        <w:t xml:space="preserve">- Validar que las vistas carguen correctamente.</w:t>
+      </w:r>
+    </w:p>
+    <w:p>
+      <w:pPr>
+        <w:rPr/>
+      </w:pPr>
+      <w:r>
+        <w:rPr>
+          <w:rtl w:val="0"/>
+        </w:rPr>
+        <w:t xml:space="preserve">- Verificar que luego de guardar un registro, este aparezca en el listado correspondiente.</w:t>
+      </w:r>
+    </w:p>
+    <w:p>
+      <w:pPr>
+        <w:rPr/>
+      </w:pPr>
+      <w:r>
+        <w:rPr>
+          <w:rtl w:val="0"/>
+        </w:rPr>
+        <w:t xml:space="preserve">- Capturar evidencia de la ejecución para incluirla en la entrega final.</w:t>
+      </w:r>
+    </w:p>
+    <w:p>
+      <w:pPr>
+        <w:rPr/>
+      </w:pPr>
+      <w:r>
+        <w:rPr>
+          <w:rtl w:val="0"/>
+        </w:rPr>
+      </w:r>
+    </w:p>
+    <w:p>
+      <w:pPr>
+        <w:pStyle w:val="Heading2"/>
+        <w:keepNext w:val="0"/>
+        <w:keepLines w:val="0"/>
+        <w:spacing w:after="80" w:lineRule="auto"/>
+        <w:rPr>
+          <w:b w:val="1"/>
+          <w:bCs w:val="1"/>
+          <w:sz w:val="34"/>
+          <w:szCs w:val="34"/>
+        </w:rPr>
+      </w:pPr>
+      <w:bookmarkStart w:colFirst="0" w:colLast="0" w:name="_q6oi8kdz79op" w:id="15"/>
+      <w:bookmarkEnd w:id="15"/>
+      <w:r>
+        <w:rPr>
+          <w:b w:val="1"/>
+          <w:bCs w:val="1"/>
+          <w:sz w:val="34"/>
+          <w:szCs w:val="34"/>
+          <w:rtl w:val="0"/>
+        </w:rPr>
+        <w:t xml:space="preserve">4.8 Ejecución y demostración</w:t>
+      </w:r>
+    </w:p>
+    <w:p>
+      <w:pPr>
+        <w:rPr/>
+      </w:pPr>
+      <w:r>
+        <w:rPr>
+          <w:rtl w:val="0"/>
+        </w:rPr>
+        <w:t xml:space="preserve">Como evidencia del proceso de validación del sistema, se incluirán capturas de pantalla y/o video most</w:t>
+      </w:r>
+    </w:p>
+    <w:p>
+      <w:pPr>
+        <w:rPr/>
+      </w:pPr>
+      <w:r>
+        <w:rPr>
+          <w:rtl w:val="0"/>
+        </w:rPr>
+      </w:r>
+    </w:p>
+    <w:p>
+      <w:pPr>
+        <w:rPr/>
+      </w:pPr>
+      <w:r>
+        <w:rPr>
+          <w:rtl w:val="0"/>
+        </w:rPr>
+        <w:t xml:space="preserve">Casos de prueba listos para poner</w:t>
+      </w:r>
+    </w:p>
     <w:p>
       <w:pPr>
         <w:rPr/>
@@ -4533,6 +8356,54 @@
     </w:tblPr>
   </w:style>
   <w:style w:type="table" w:styleId="Table2">
+    <w:basedOn w:val="TableNormal"/>
+    <w:tblPr>
+      <w:tblStyleRowBandSize w:val="1"/>
+      <w:tblStyleColBandSize w:val="1"/>
+      <w:tblCellMar/>
+    </w:tblPr>
+  </w:style>
+  <w:style w:type="table" w:styleId="Table3">
+    <w:basedOn w:val="TableNormal"/>
+    <w:tblPr>
+      <w:tblStyleRowBandSize w:val="1"/>
+      <w:tblStyleColBandSize w:val="1"/>
+      <w:tblCellMar/>
+    </w:tblPr>
+  </w:style>
+  <w:style w:type="table" w:styleId="Table4">
+    <w:basedOn w:val="TableNormal"/>
+    <w:tblPr>
+      <w:tblStyleRowBandSize w:val="1"/>
+      <w:tblStyleColBandSize w:val="1"/>
+      <w:tblCellMar/>
+    </w:tblPr>
+  </w:style>
+  <w:style w:type="table" w:styleId="Table5">
+    <w:basedOn w:val="TableNormal"/>
+    <w:tblPr>
+      <w:tblStyleRowBandSize w:val="1"/>
+      <w:tblStyleColBandSize w:val="1"/>
+      <w:tblCellMar/>
+    </w:tblPr>
+  </w:style>
+  <w:style w:type="table" w:styleId="Table6">
+    <w:basedOn w:val="TableNormal"/>
+    <w:tblPr>
+      <w:tblStyleRowBandSize w:val="1"/>
+      <w:tblStyleColBandSize w:val="1"/>
+      <w:tblCellMar/>
+    </w:tblPr>
+  </w:style>
+  <w:style w:type="table" w:styleId="Table7">
+    <w:basedOn w:val="TableNormal"/>
+    <w:tblPr>
+      <w:tblStyleRowBandSize w:val="1"/>
+      <w:tblStyleColBandSize w:val="1"/>
+      <w:tblCellMar/>
+    </w:tblPr>
+  </w:style>
+  <w:style w:type="table" w:styleId="Table8">
     <w:basedOn w:val="TableNormal"/>
     <w:tblPr>
       <w:tblStyleRowBandSize w:val="1"/>

</xml_diff>